<commit_message>
Polish quizzes, plans, practices and templates
Quizzes now mix question types; Excel plans show academic hours; the landing describes the materials and lists the toolkit. Practices put all work under Ход работы, keep only evidence screenshots, drop self-check answers into a non-copyable question list, and code blocks carry language labels. Report templates gain a Ход работы section and lose answer fields and header screenshots; README is updated.
</commit_message>
<xml_diff>
--- a/courses/3/project-management/dist/reports/PM_practice-01_charter-template.docx
+++ b/courses/3/project-management/dist/reports/PM_practice-01_charter-template.docx
@@ -39,19 +39,6 @@
           <w:sz w:val="24"/>
         </w:rPr>
         <w:t>Устав проекта</w:t>
-      </w:r>
-    </w:p>
-    <w:p>
-      <w:pPr>
-        <w:jc w:val="center"/>
-      </w:pPr>
-      <w:r>
-        <w:rPr>
-          <w:b w:val="0"/>
-          <w:i/>
-          <w:sz w:val="24"/>
-        </w:rPr>
-        <w:t>Продолжительность: 90 минут</w:t>
       </w:r>
     </w:p>
     <w:p/>
@@ -107,6 +94,15 @@
       </w:r>
     </w:p>
     <w:p/>
+    <w:p>
+      <w:r>
+        <w:rPr>
+          <w:b/>
+          <w:sz w:val="24"/>
+        </w:rPr>
+        <w:t>Ход работы</w:t>
+      </w:r>
+    </w:p>
     <w:p>
       <w:r>
         <w:rPr>

</xml_diff>

<commit_message>
Tidy lesson cards, screenshots and DOCX report formatting
- remove lesson duration from plan cards and halve the card illustrations
- remove negative screenshot wording and add positive evidence reminders
- format all DOCX report templates to the attached report standard
- document the report format rule for future courses
</commit_message>
<xml_diff>
--- a/courses/3/project-management/dist/reports/PM_practice-01_charter-template.docx
+++ b/courses/3/project-management/dist/reports/PM_practice-01_charter-template.docx
@@ -4,10 +4,13 @@
   <w:body>
     <w:p>
       <w:pPr>
+        <w:spacing w:line="360" w:lineRule="auto" w:before="0" w:after="0"/>
+        <w:ind w:firstLine="0"/>
         <w:jc w:val="center"/>
       </w:pPr>
       <w:r>
         <w:rPr>
+          <w:rFonts w:ascii="Times New Roman" w:hAnsi="Times New Roman" w:eastAsia="Times New Roman" w:cs="Times New Roman"/>
           <w:b/>
           <w:i w:val="0"/>
           <w:sz w:val="28"/>
@@ -17,98 +20,155 @@
     </w:p>
     <w:p>
       <w:pPr>
+        <w:spacing w:line="360" w:lineRule="auto" w:before="0" w:after="0"/>
+        <w:ind w:firstLine="0"/>
         <w:jc w:val="center"/>
       </w:pPr>
       <w:r>
         <w:rPr>
+          <w:rFonts w:ascii="Times New Roman" w:hAnsi="Times New Roman" w:eastAsia="Times New Roman" w:cs="Times New Roman"/>
           <w:b/>
           <w:i w:val="0"/>
-          <w:sz w:val="26"/>
+          <w:sz w:val="28"/>
         </w:rPr>
         <w:t>Практическая работа 1</w:t>
       </w:r>
     </w:p>
     <w:p>
       <w:pPr>
+        <w:spacing w:line="360" w:lineRule="auto" w:before="0" w:after="0"/>
+        <w:ind w:firstLine="0"/>
         <w:jc w:val="center"/>
       </w:pPr>
       <w:r>
         <w:rPr>
+          <w:rFonts w:ascii="Times New Roman" w:hAnsi="Times New Roman" w:eastAsia="Times New Roman" w:cs="Times New Roman"/>
           <w:b w:val="0"/>
           <w:i w:val="0"/>
-          <w:sz w:val="24"/>
+          <w:sz w:val="28"/>
         </w:rPr>
         <w:t>Устав проекта</w:t>
       </w:r>
     </w:p>
     <w:p/>
     <w:p>
+      <w:pPr>
+        <w:spacing w:line="360" w:lineRule="auto" w:before="0" w:after="0"/>
+        <w:ind w:firstLine="0"/>
+        <w:jc w:val="left"/>
+      </w:pPr>
       <w:r>
         <w:rPr>
+          <w:rFonts w:ascii="Times New Roman" w:hAnsi="Times New Roman" w:eastAsia="Times New Roman" w:cs="Times New Roman"/>
           <w:b w:val="0"/>
           <w:i w:val="0"/>
-          <w:sz w:val="24"/>
+          <w:sz w:val="28"/>
         </w:rPr>
         <w:t>ФИО студента: ______________________________________</w:t>
       </w:r>
     </w:p>
     <w:p>
+      <w:pPr>
+        <w:spacing w:line="360" w:lineRule="auto" w:before="0" w:after="0"/>
+        <w:ind w:firstLine="0"/>
+        <w:jc w:val="left"/>
+      </w:pPr>
       <w:r>
         <w:rPr>
+          <w:rFonts w:ascii="Times New Roman" w:hAnsi="Times New Roman" w:eastAsia="Times New Roman" w:cs="Times New Roman"/>
           <w:b w:val="0"/>
           <w:i w:val="0"/>
-          <w:sz w:val="24"/>
+          <w:sz w:val="28"/>
         </w:rPr>
         <w:t>Группа: ______________________  Дата: _______________</w:t>
       </w:r>
     </w:p>
     <w:p>
+      <w:pPr>
+        <w:spacing w:line="360" w:lineRule="auto" w:before="0" w:after="0"/>
+        <w:ind w:firstLine="0"/>
+        <w:jc w:val="left"/>
+      </w:pPr>
       <w:r>
         <w:rPr>
+          <w:rFonts w:ascii="Times New Roman" w:hAnsi="Times New Roman" w:eastAsia="Times New Roman" w:cs="Times New Roman"/>
           <w:b w:val="0"/>
           <w:i w:val="0"/>
-          <w:sz w:val="24"/>
+          <w:sz w:val="28"/>
         </w:rPr>
         <w:t>Проект: ____________________________________________</w:t>
       </w:r>
     </w:p>
     <w:p/>
     <w:p>
+      <w:pPr>
+        <w:pStyle w:val="Heading1"/>
+        <w:keepNext/>
+        <w:keepLines/>
+        <w:spacing w:line="240" w:lineRule="auto" w:before="240" w:after="0"/>
+        <w:ind w:left="0" w:firstLine="0"/>
+        <w:jc w:val="both"/>
+      </w:pPr>
       <w:r>
         <w:rPr>
-          <w:b/>
+          <w:rFonts w:ascii="Times New Roman" w:hAnsi="Times New Roman" w:eastAsia="Times New Roman" w:cs="Times New Roman"/>
+          <w:b w:val="0"/>
           <w:i w:val="0"/>
-          <w:sz w:val="24"/>
+          <w:sz w:val="28"/>
         </w:rPr>
         <w:t>Цель работы</w:t>
       </w:r>
     </w:p>
     <w:p>
+      <w:pPr>
+        <w:spacing w:line="360" w:lineRule="auto" w:before="0" w:after="0"/>
+        <w:ind w:firstLine="709"/>
+        <w:jc w:val="both"/>
+      </w:pPr>
       <w:r>
         <w:rPr>
+          <w:rFonts w:ascii="Times New Roman" w:hAnsi="Times New Roman" w:eastAsia="Times New Roman" w:cs="Times New Roman"/>
           <w:b w:val="0"/>
           <w:i w:val="0"/>
-          <w:sz w:val="24"/>
+          <w:sz w:val="28"/>
         </w:rPr>
         <w:t>Собрать и проверить проектный документ так, чтобы его мог понять новый участник команды и комиссия. Все решения должны опираться на числа и проверяемые факты.</w:t>
       </w:r>
     </w:p>
     <w:p/>
     <w:p>
+      <w:pPr>
+        <w:pStyle w:val="Heading1"/>
+        <w:keepNext/>
+        <w:keepLines/>
+        <w:spacing w:line="240" w:lineRule="auto" w:before="240" w:after="0"/>
+        <w:ind w:left="0" w:firstLine="0"/>
+        <w:jc w:val="both"/>
+      </w:pPr>
       <w:r>
         <w:rPr>
-          <w:b/>
-          <w:sz w:val="24"/>
+          <w:rFonts w:ascii="Times New Roman" w:hAnsi="Times New Roman" w:eastAsia="Times New Roman" w:cs="Times New Roman"/>
+          <w:b w:val="0"/>
+          <w:sz w:val="28"/>
         </w:rPr>
         <w:t>Ход работы</w:t>
       </w:r>
     </w:p>
     <w:p>
+      <w:pPr>
+        <w:pStyle w:val="Heading2"/>
+        <w:keepNext/>
+        <w:keepLines/>
+        <w:spacing w:line="240" w:lineRule="auto" w:before="40" w:after="0"/>
+        <w:ind w:left="0" w:firstLine="0"/>
+        <w:jc w:val="left"/>
+      </w:pPr>
       <w:r>
         <w:rPr>
+          <w:rFonts w:ascii="Times New Roman" w:hAnsi="Times New Roman" w:eastAsia="Times New Roman" w:cs="Times New Roman"/>
           <w:b/>
           <w:i w:val="0"/>
-          <w:sz w:val="24"/>
+          <w:sz w:val="28"/>
         </w:rPr>
         <w:t>1. Общие сведения</w:t>
       </w:r>
@@ -117,6 +177,7 @@
       <w:tblPr>
         <w:tblStyle w:val="TableGrid"/>
         <w:tblW w:type="auto" w:w="0"/>
+        <w:tblLayout w:type="autofit"/>
         <w:tblLook w:firstColumn="1" w:firstRow="1" w:lastColumn="0" w:lastRow="0" w:noHBand="0" w:noVBand="1" w:val="04A0"/>
       </w:tblPr>
       <w:tblGrid>
@@ -129,10 +190,16 @@
             <w:tcW w:type="dxa" w:w="4320"/>
           </w:tcPr>
           <w:p>
+            <w:pPr>
+              <w:spacing w:line="360" w:lineRule="auto" w:before="0" w:after="0"/>
+              <w:ind w:firstLine="0"/>
+              <w:jc w:val="center"/>
+            </w:pPr>
             <w:r>
               <w:rPr>
+                <w:rFonts w:ascii="Times New Roman" w:hAnsi="Times New Roman" w:eastAsia="Times New Roman" w:cs="Times New Roman"/>
                 <w:b/>
-                <w:sz w:val="18"/>
+                <w:sz w:val="22"/>
               </w:rPr>
               <w:t>Поле</w:t>
             </w:r>
@@ -143,10 +210,16 @@
             <w:tcW w:type="dxa" w:w="4320"/>
           </w:tcPr>
           <w:p>
+            <w:pPr>
+              <w:spacing w:line="360" w:lineRule="auto" w:before="0" w:after="0"/>
+              <w:ind w:firstLine="0"/>
+              <w:jc w:val="center"/>
+            </w:pPr>
             <w:r>
               <w:rPr>
+                <w:rFonts w:ascii="Times New Roman" w:hAnsi="Times New Roman" w:eastAsia="Times New Roman" w:cs="Times New Roman"/>
                 <w:b/>
-                <w:sz w:val="18"/>
+                <w:sz w:val="22"/>
               </w:rPr>
               <w:t>Значение</w:t>
             </w:r>
@@ -159,9 +232,16 @@
             <w:tcW w:type="dxa" w:w="4320"/>
           </w:tcPr>
           <w:p>
+            <w:pPr>
+              <w:spacing w:line="360" w:lineRule="auto" w:before="0" w:after="0"/>
+              <w:ind w:firstLine="0"/>
+              <w:jc w:val="both"/>
+            </w:pPr>
             <w:r>
               <w:rPr>
-                <w:sz w:val="18"/>
+                <w:rFonts w:ascii="Times New Roman" w:hAnsi="Times New Roman" w:eastAsia="Times New Roman" w:cs="Times New Roman"/>
+                <w:b w:val="0"/>
+                <w:sz w:val="22"/>
               </w:rPr>
               <w:t>Название проекта</w:t>
             </w:r>
@@ -172,9 +252,16 @@
             <w:tcW w:type="dxa" w:w="4320"/>
           </w:tcPr>
           <w:p>
+            <w:pPr>
+              <w:spacing w:line="360" w:lineRule="auto" w:before="0" w:after="0"/>
+              <w:ind w:firstLine="0"/>
+              <w:jc w:val="both"/>
+            </w:pPr>
             <w:r>
               <w:rPr>
-                <w:sz w:val="18"/>
+                <w:rFonts w:ascii="Times New Roman" w:hAnsi="Times New Roman" w:eastAsia="Times New Roman" w:cs="Times New Roman"/>
+                <w:b w:val="0"/>
+                <w:sz w:val="22"/>
               </w:rPr>
             </w:r>
           </w:p>
@@ -186,9 +273,16 @@
             <w:tcW w:type="dxa" w:w="4320"/>
           </w:tcPr>
           <w:p>
+            <w:pPr>
+              <w:spacing w:line="360" w:lineRule="auto" w:before="0" w:after="0"/>
+              <w:ind w:firstLine="0"/>
+              <w:jc w:val="both"/>
+            </w:pPr>
             <w:r>
               <w:rPr>
-                <w:sz w:val="18"/>
+                <w:rFonts w:ascii="Times New Roman" w:hAnsi="Times New Roman" w:eastAsia="Times New Roman" w:cs="Times New Roman"/>
+                <w:b w:val="0"/>
+                <w:sz w:val="22"/>
               </w:rPr>
               <w:t>Заказчик</w:t>
             </w:r>
@@ -199,9 +293,16 @@
             <w:tcW w:type="dxa" w:w="4320"/>
           </w:tcPr>
           <w:p>
+            <w:pPr>
+              <w:spacing w:line="360" w:lineRule="auto" w:before="0" w:after="0"/>
+              <w:ind w:firstLine="0"/>
+              <w:jc w:val="both"/>
+            </w:pPr>
             <w:r>
               <w:rPr>
-                <w:sz w:val="18"/>
+                <w:rFonts w:ascii="Times New Roman" w:hAnsi="Times New Roman" w:eastAsia="Times New Roman" w:cs="Times New Roman"/>
+                <w:b w:val="0"/>
+                <w:sz w:val="22"/>
               </w:rPr>
             </w:r>
           </w:p>
@@ -213,9 +314,16 @@
             <w:tcW w:type="dxa" w:w="4320"/>
           </w:tcPr>
           <w:p>
+            <w:pPr>
+              <w:spacing w:line="360" w:lineRule="auto" w:before="0" w:after="0"/>
+              <w:ind w:firstLine="0"/>
+              <w:jc w:val="both"/>
+            </w:pPr>
             <w:r>
               <w:rPr>
-                <w:sz w:val="18"/>
+                <w:rFonts w:ascii="Times New Roman" w:hAnsi="Times New Roman" w:eastAsia="Times New Roman" w:cs="Times New Roman"/>
+                <w:b w:val="0"/>
+                <w:sz w:val="22"/>
               </w:rPr>
               <w:t>Спонсор</w:t>
             </w:r>
@@ -226,9 +334,16 @@
             <w:tcW w:type="dxa" w:w="4320"/>
           </w:tcPr>
           <w:p>
+            <w:pPr>
+              <w:spacing w:line="360" w:lineRule="auto" w:before="0" w:after="0"/>
+              <w:ind w:firstLine="0"/>
+              <w:jc w:val="both"/>
+            </w:pPr>
             <w:r>
               <w:rPr>
-                <w:sz w:val="18"/>
+                <w:rFonts w:ascii="Times New Roman" w:hAnsi="Times New Roman" w:eastAsia="Times New Roman" w:cs="Times New Roman"/>
+                <w:b w:val="0"/>
+                <w:sz w:val="22"/>
               </w:rPr>
             </w:r>
           </w:p>
@@ -240,9 +355,16 @@
             <w:tcW w:type="dxa" w:w="4320"/>
           </w:tcPr>
           <w:p>
+            <w:pPr>
+              <w:spacing w:line="360" w:lineRule="auto" w:before="0" w:after="0"/>
+              <w:ind w:firstLine="0"/>
+              <w:jc w:val="both"/>
+            </w:pPr>
             <w:r>
               <w:rPr>
-                <w:sz w:val="18"/>
+                <w:rFonts w:ascii="Times New Roman" w:hAnsi="Times New Roman" w:eastAsia="Times New Roman" w:cs="Times New Roman"/>
+                <w:b w:val="0"/>
+                <w:sz w:val="22"/>
               </w:rPr>
               <w:t>Руководитель проекта</w:t>
             </w:r>
@@ -253,9 +375,16 @@
             <w:tcW w:type="dxa" w:w="4320"/>
           </w:tcPr>
           <w:p>
+            <w:pPr>
+              <w:spacing w:line="360" w:lineRule="auto" w:before="0" w:after="0"/>
+              <w:ind w:firstLine="0"/>
+              <w:jc w:val="both"/>
+            </w:pPr>
             <w:r>
               <w:rPr>
-                <w:sz w:val="18"/>
+                <w:rFonts w:ascii="Times New Roman" w:hAnsi="Times New Roman" w:eastAsia="Times New Roman" w:cs="Times New Roman"/>
+                <w:b w:val="0"/>
+                <w:sz w:val="22"/>
               </w:rPr>
             </w:r>
           </w:p>
@@ -267,9 +396,16 @@
             <w:tcW w:type="dxa" w:w="4320"/>
           </w:tcPr>
           <w:p>
+            <w:pPr>
+              <w:spacing w:line="360" w:lineRule="auto" w:before="0" w:after="0"/>
+              <w:ind w:firstLine="0"/>
+              <w:jc w:val="both"/>
+            </w:pPr>
             <w:r>
               <w:rPr>
-                <w:sz w:val="18"/>
+                <w:rFonts w:ascii="Times New Roman" w:hAnsi="Times New Roman" w:eastAsia="Times New Roman" w:cs="Times New Roman"/>
+                <w:b w:val="0"/>
+                <w:sz w:val="22"/>
               </w:rPr>
               <w:t>Дата старта и дата результата</w:t>
             </w:r>
@@ -280,9 +416,16 @@
             <w:tcW w:type="dxa" w:w="4320"/>
           </w:tcPr>
           <w:p>
+            <w:pPr>
+              <w:spacing w:line="360" w:lineRule="auto" w:before="0" w:after="0"/>
+              <w:ind w:firstLine="0"/>
+              <w:jc w:val="both"/>
+            </w:pPr>
             <w:r>
               <w:rPr>
-                <w:sz w:val="18"/>
+                <w:rFonts w:ascii="Times New Roman" w:hAnsi="Times New Roman" w:eastAsia="Times New Roman" w:cs="Times New Roman"/>
+                <w:b w:val="0"/>
+                <w:sz w:val="22"/>
               </w:rPr>
             </w:r>
           </w:p>
@@ -291,61 +434,103 @@
     </w:tbl>
     <w:p/>
     <w:p>
+      <w:pPr>
+        <w:pStyle w:val="Heading2"/>
+        <w:keepNext/>
+        <w:keepLines/>
+        <w:spacing w:line="240" w:lineRule="auto" w:before="40" w:after="0"/>
+        <w:ind w:left="0" w:firstLine="0"/>
+        <w:jc w:val="left"/>
+      </w:pPr>
       <w:r>
         <w:rPr>
+          <w:rFonts w:ascii="Times New Roman" w:hAnsi="Times New Roman" w:eastAsia="Times New Roman" w:cs="Times New Roman"/>
           <w:b/>
           <w:i w:val="0"/>
-          <w:sz w:val="24"/>
+          <w:sz w:val="28"/>
         </w:rPr>
         <w:t>2. Цель и выгода</w:t>
       </w:r>
     </w:p>
     <w:p>
+      <w:pPr>
+        <w:spacing w:line="360" w:lineRule="auto" w:before="0" w:after="0"/>
+        <w:ind w:firstLine="709"/>
+        <w:jc w:val="both"/>
+      </w:pPr>
       <w:r>
         <w:rPr>
+          <w:rFonts w:ascii="Times New Roman" w:hAnsi="Times New Roman" w:eastAsia="Times New Roman" w:cs="Times New Roman"/>
           <w:b w:val="0"/>
           <w:i w:val="0"/>
-          <w:sz w:val="24"/>
+          <w:sz w:val="28"/>
         </w:rPr>
         <w:t>Цель по SMART (одно предложение, измеримая):</w:t>
       </w:r>
     </w:p>
     <w:p>
+      <w:pPr>
+        <w:spacing w:line="360" w:lineRule="auto" w:before="0" w:after="0"/>
+        <w:ind w:firstLine="709"/>
+        <w:jc w:val="both"/>
+      </w:pPr>
       <w:r>
         <w:rPr>
+          <w:rFonts w:ascii="Times New Roman" w:hAnsi="Times New Roman" w:eastAsia="Times New Roman" w:cs="Times New Roman"/>
           <w:b w:val="0"/>
           <w:i w:val="0"/>
-          <w:sz w:val="24"/>
+          <w:sz w:val="28"/>
         </w:rPr>
         <w:t>________________________________________________________________________</w:t>
       </w:r>
     </w:p>
     <w:p>
+      <w:pPr>
+        <w:spacing w:line="360" w:lineRule="auto" w:before="0" w:after="0"/>
+        <w:ind w:firstLine="709"/>
+        <w:jc w:val="both"/>
+      </w:pPr>
       <w:r>
         <w:rPr>
+          <w:rFonts w:ascii="Times New Roman" w:hAnsi="Times New Roman" w:eastAsia="Times New Roman" w:cs="Times New Roman"/>
           <w:b w:val="0"/>
           <w:i w:val="0"/>
-          <w:sz w:val="24"/>
+          <w:sz w:val="28"/>
         </w:rPr>
         <w:t>Выгода для колледжа (что изменится после запуска):</w:t>
       </w:r>
     </w:p>
     <w:p>
+      <w:pPr>
+        <w:spacing w:line="360" w:lineRule="auto" w:before="0" w:after="0"/>
+        <w:ind w:firstLine="709"/>
+        <w:jc w:val="both"/>
+      </w:pPr>
       <w:r>
         <w:rPr>
+          <w:rFonts w:ascii="Times New Roman" w:hAnsi="Times New Roman" w:eastAsia="Times New Roman" w:cs="Times New Roman"/>
           <w:b w:val="0"/>
           <w:i w:val="0"/>
-          <w:sz w:val="24"/>
+          <w:sz w:val="28"/>
         </w:rPr>
         <w:t>________________________________________________________________________</w:t>
       </w:r>
     </w:p>
     <w:p>
+      <w:pPr>
+        <w:pStyle w:val="Heading2"/>
+        <w:keepNext/>
+        <w:keepLines/>
+        <w:spacing w:line="240" w:lineRule="auto" w:before="40" w:after="0"/>
+        <w:ind w:left="0" w:firstLine="0"/>
+        <w:jc w:val="left"/>
+      </w:pPr>
       <w:r>
         <w:rPr>
+          <w:rFonts w:ascii="Times New Roman" w:hAnsi="Times New Roman" w:eastAsia="Times New Roman" w:cs="Times New Roman"/>
           <w:b/>
           <w:i w:val="0"/>
-          <w:sz w:val="24"/>
+          <w:sz w:val="28"/>
         </w:rPr>
         <w:t>3. Границы проекта</w:t>
       </w:r>
@@ -354,6 +539,7 @@
       <w:tblPr>
         <w:tblStyle w:val="TableGrid"/>
         <w:tblW w:type="auto" w:w="0"/>
+        <w:tblLayout w:type="autofit"/>
         <w:tblLook w:firstColumn="1" w:firstRow="1" w:lastColumn="0" w:lastRow="0" w:noHBand="0" w:noVBand="1" w:val="04A0"/>
       </w:tblPr>
       <w:tblGrid>
@@ -366,10 +552,16 @@
             <w:tcW w:type="dxa" w:w="4320"/>
           </w:tcPr>
           <w:p>
+            <w:pPr>
+              <w:spacing w:line="360" w:lineRule="auto" w:before="0" w:after="0"/>
+              <w:ind w:firstLine="0"/>
+              <w:jc w:val="center"/>
+            </w:pPr>
             <w:r>
               <w:rPr>
+                <w:rFonts w:ascii="Times New Roman" w:hAnsi="Times New Roman" w:eastAsia="Times New Roman" w:cs="Times New Roman"/>
                 <w:b/>
-                <w:sz w:val="18"/>
+                <w:sz w:val="22"/>
               </w:rPr>
               <w:t>Входит в проект</w:t>
             </w:r>
@@ -380,10 +572,16 @@
             <w:tcW w:type="dxa" w:w="4320"/>
           </w:tcPr>
           <w:p>
+            <w:pPr>
+              <w:spacing w:line="360" w:lineRule="auto" w:before="0" w:after="0"/>
+              <w:ind w:firstLine="0"/>
+              <w:jc w:val="center"/>
+            </w:pPr>
             <w:r>
               <w:rPr>
+                <w:rFonts w:ascii="Times New Roman" w:hAnsi="Times New Roman" w:eastAsia="Times New Roman" w:cs="Times New Roman"/>
                 <w:b/>
-                <w:sz w:val="18"/>
+                <w:sz w:val="22"/>
               </w:rPr>
               <w:t>Не входит в проект</w:t>
             </w:r>
@@ -396,9 +594,16 @@
             <w:tcW w:type="dxa" w:w="4320"/>
           </w:tcPr>
           <w:p>
+            <w:pPr>
+              <w:spacing w:line="360" w:lineRule="auto" w:before="0" w:after="0"/>
+              <w:ind w:firstLine="0"/>
+              <w:jc w:val="both"/>
+            </w:pPr>
             <w:r>
               <w:rPr>
-                <w:sz w:val="18"/>
+                <w:rFonts w:ascii="Times New Roman" w:hAnsi="Times New Roman" w:eastAsia="Times New Roman" w:cs="Times New Roman"/>
+                <w:b w:val="0"/>
+                <w:sz w:val="22"/>
               </w:rPr>
             </w:r>
           </w:p>
@@ -408,9 +613,16 @@
             <w:tcW w:type="dxa" w:w="4320"/>
           </w:tcPr>
           <w:p>
+            <w:pPr>
+              <w:spacing w:line="360" w:lineRule="auto" w:before="0" w:after="0"/>
+              <w:ind w:firstLine="0"/>
+              <w:jc w:val="both"/>
+            </w:pPr>
             <w:r>
               <w:rPr>
-                <w:sz w:val="18"/>
+                <w:rFonts w:ascii="Times New Roman" w:hAnsi="Times New Roman" w:eastAsia="Times New Roman" w:cs="Times New Roman"/>
+                <w:b w:val="0"/>
+                <w:sz w:val="22"/>
               </w:rPr>
             </w:r>
           </w:p>
@@ -422,9 +634,16 @@
             <w:tcW w:type="dxa" w:w="4320"/>
           </w:tcPr>
           <w:p>
+            <w:pPr>
+              <w:spacing w:line="360" w:lineRule="auto" w:before="0" w:after="0"/>
+              <w:ind w:firstLine="0"/>
+              <w:jc w:val="both"/>
+            </w:pPr>
             <w:r>
               <w:rPr>
-                <w:sz w:val="18"/>
+                <w:rFonts w:ascii="Times New Roman" w:hAnsi="Times New Roman" w:eastAsia="Times New Roman" w:cs="Times New Roman"/>
+                <w:b w:val="0"/>
+                <w:sz w:val="22"/>
               </w:rPr>
             </w:r>
           </w:p>
@@ -434,9 +653,16 @@
             <w:tcW w:type="dxa" w:w="4320"/>
           </w:tcPr>
           <w:p>
+            <w:pPr>
+              <w:spacing w:line="360" w:lineRule="auto" w:before="0" w:after="0"/>
+              <w:ind w:firstLine="0"/>
+              <w:jc w:val="both"/>
+            </w:pPr>
             <w:r>
               <w:rPr>
-                <w:sz w:val="18"/>
+                <w:rFonts w:ascii="Times New Roman" w:hAnsi="Times New Roman" w:eastAsia="Times New Roman" w:cs="Times New Roman"/>
+                <w:b w:val="0"/>
+                <w:sz w:val="22"/>
               </w:rPr>
             </w:r>
           </w:p>
@@ -448,9 +674,16 @@
             <w:tcW w:type="dxa" w:w="4320"/>
           </w:tcPr>
           <w:p>
+            <w:pPr>
+              <w:spacing w:line="360" w:lineRule="auto" w:before="0" w:after="0"/>
+              <w:ind w:firstLine="0"/>
+              <w:jc w:val="both"/>
+            </w:pPr>
             <w:r>
               <w:rPr>
-                <w:sz w:val="18"/>
+                <w:rFonts w:ascii="Times New Roman" w:hAnsi="Times New Roman" w:eastAsia="Times New Roman" w:cs="Times New Roman"/>
+                <w:b w:val="0"/>
+                <w:sz w:val="22"/>
               </w:rPr>
             </w:r>
           </w:p>
@@ -460,9 +693,16 @@
             <w:tcW w:type="dxa" w:w="4320"/>
           </w:tcPr>
           <w:p>
+            <w:pPr>
+              <w:spacing w:line="360" w:lineRule="auto" w:before="0" w:after="0"/>
+              <w:ind w:firstLine="0"/>
+              <w:jc w:val="both"/>
+            </w:pPr>
             <w:r>
               <w:rPr>
-                <w:sz w:val="18"/>
+                <w:rFonts w:ascii="Times New Roman" w:hAnsi="Times New Roman" w:eastAsia="Times New Roman" w:cs="Times New Roman"/>
+                <w:b w:val="0"/>
+                <w:sz w:val="22"/>
               </w:rPr>
             </w:r>
           </w:p>
@@ -474,9 +714,16 @@
             <w:tcW w:type="dxa" w:w="4320"/>
           </w:tcPr>
           <w:p>
+            <w:pPr>
+              <w:spacing w:line="360" w:lineRule="auto" w:before="0" w:after="0"/>
+              <w:ind w:firstLine="0"/>
+              <w:jc w:val="both"/>
+            </w:pPr>
             <w:r>
               <w:rPr>
-                <w:sz w:val="18"/>
+                <w:rFonts w:ascii="Times New Roman" w:hAnsi="Times New Roman" w:eastAsia="Times New Roman" w:cs="Times New Roman"/>
+                <w:b w:val="0"/>
+                <w:sz w:val="22"/>
               </w:rPr>
             </w:r>
           </w:p>
@@ -486,9 +733,16 @@
             <w:tcW w:type="dxa" w:w="4320"/>
           </w:tcPr>
           <w:p>
+            <w:pPr>
+              <w:spacing w:line="360" w:lineRule="auto" w:before="0" w:after="0"/>
+              <w:ind w:firstLine="0"/>
+              <w:jc w:val="both"/>
+            </w:pPr>
             <w:r>
               <w:rPr>
-                <w:sz w:val="18"/>
+                <w:rFonts w:ascii="Times New Roman" w:hAnsi="Times New Roman" w:eastAsia="Times New Roman" w:cs="Times New Roman"/>
+                <w:b w:val="0"/>
+                <w:sz w:val="22"/>
               </w:rPr>
             </w:r>
           </w:p>
@@ -497,11 +751,20 @@
     </w:tbl>
     <w:p/>
     <w:p>
+      <w:pPr>
+        <w:pStyle w:val="Heading2"/>
+        <w:keepNext/>
+        <w:keepLines/>
+        <w:spacing w:line="240" w:lineRule="auto" w:before="40" w:after="0"/>
+        <w:ind w:left="0" w:firstLine="0"/>
+        <w:jc w:val="left"/>
+      </w:pPr>
       <w:r>
         <w:rPr>
+          <w:rFonts w:ascii="Times New Roman" w:hAnsi="Times New Roman" w:eastAsia="Times New Roman" w:cs="Times New Roman"/>
           <w:b/>
           <w:i w:val="0"/>
-          <w:sz w:val="24"/>
+          <w:sz w:val="28"/>
         </w:rPr>
         <w:t>4. Результаты и вехи</w:t>
       </w:r>
@@ -510,6 +773,7 @@
       <w:tblPr>
         <w:tblStyle w:val="TableGrid"/>
         <w:tblW w:type="auto" w:w="0"/>
+        <w:tblLayout w:type="autofit"/>
         <w:tblLook w:firstColumn="1" w:firstRow="1" w:lastColumn="0" w:lastRow="0" w:noHBand="0" w:noVBand="1" w:val="04A0"/>
       </w:tblPr>
       <w:tblGrid>
@@ -523,10 +787,16 @@
             <w:tcW w:type="dxa" w:w="2880"/>
           </w:tcPr>
           <w:p>
+            <w:pPr>
+              <w:spacing w:line="360" w:lineRule="auto" w:before="0" w:after="0"/>
+              <w:ind w:firstLine="0"/>
+              <w:jc w:val="center"/>
+            </w:pPr>
             <w:r>
               <w:rPr>
+                <w:rFonts w:ascii="Times New Roman" w:hAnsi="Times New Roman" w:eastAsia="Times New Roman" w:cs="Times New Roman"/>
                 <w:b/>
-                <w:sz w:val="18"/>
+                <w:sz w:val="22"/>
               </w:rPr>
               <w:t>Результат</w:t>
             </w:r>
@@ -537,10 +807,16 @@
             <w:tcW w:type="dxa" w:w="2880"/>
           </w:tcPr>
           <w:p>
+            <w:pPr>
+              <w:spacing w:line="360" w:lineRule="auto" w:before="0" w:after="0"/>
+              <w:ind w:firstLine="0"/>
+              <w:jc w:val="center"/>
+            </w:pPr>
             <w:r>
               <w:rPr>
+                <w:rFonts w:ascii="Times New Roman" w:hAnsi="Times New Roman" w:eastAsia="Times New Roman" w:cs="Times New Roman"/>
                 <w:b/>
-                <w:sz w:val="18"/>
+                <w:sz w:val="22"/>
               </w:rPr>
               <w:t>Критерий готовности</w:t>
             </w:r>
@@ -551,10 +827,16 @@
             <w:tcW w:type="dxa" w:w="2880"/>
           </w:tcPr>
           <w:p>
+            <w:pPr>
+              <w:spacing w:line="360" w:lineRule="auto" w:before="0" w:after="0"/>
+              <w:ind w:firstLine="0"/>
+              <w:jc w:val="center"/>
+            </w:pPr>
             <w:r>
               <w:rPr>
+                <w:rFonts w:ascii="Times New Roman" w:hAnsi="Times New Roman" w:eastAsia="Times New Roman" w:cs="Times New Roman"/>
                 <w:b/>
-                <w:sz w:val="18"/>
+                <w:sz w:val="22"/>
               </w:rPr>
               <w:t>Дата</w:t>
             </w:r>
@@ -567,9 +849,16 @@
             <w:tcW w:type="dxa" w:w="2880"/>
           </w:tcPr>
           <w:p>
+            <w:pPr>
+              <w:spacing w:line="360" w:lineRule="auto" w:before="0" w:after="0"/>
+              <w:ind w:firstLine="0"/>
+              <w:jc w:val="both"/>
+            </w:pPr>
             <w:r>
               <w:rPr>
-                <w:sz w:val="18"/>
+                <w:rFonts w:ascii="Times New Roman" w:hAnsi="Times New Roman" w:eastAsia="Times New Roman" w:cs="Times New Roman"/>
+                <w:b w:val="0"/>
+                <w:sz w:val="22"/>
               </w:rPr>
             </w:r>
           </w:p>
@@ -579,9 +868,16 @@
             <w:tcW w:type="dxa" w:w="2880"/>
           </w:tcPr>
           <w:p>
+            <w:pPr>
+              <w:spacing w:line="360" w:lineRule="auto" w:before="0" w:after="0"/>
+              <w:ind w:firstLine="0"/>
+              <w:jc w:val="both"/>
+            </w:pPr>
             <w:r>
               <w:rPr>
-                <w:sz w:val="18"/>
+                <w:rFonts w:ascii="Times New Roman" w:hAnsi="Times New Roman" w:eastAsia="Times New Roman" w:cs="Times New Roman"/>
+                <w:b w:val="0"/>
+                <w:sz w:val="22"/>
               </w:rPr>
             </w:r>
           </w:p>
@@ -591,9 +887,16 @@
             <w:tcW w:type="dxa" w:w="2880"/>
           </w:tcPr>
           <w:p>
+            <w:pPr>
+              <w:spacing w:line="360" w:lineRule="auto" w:before="0" w:after="0"/>
+              <w:ind w:firstLine="0"/>
+              <w:jc w:val="both"/>
+            </w:pPr>
             <w:r>
               <w:rPr>
-                <w:sz w:val="18"/>
+                <w:rFonts w:ascii="Times New Roman" w:hAnsi="Times New Roman" w:eastAsia="Times New Roman" w:cs="Times New Roman"/>
+                <w:b w:val="0"/>
+                <w:sz w:val="22"/>
               </w:rPr>
             </w:r>
           </w:p>
@@ -605,9 +908,16 @@
             <w:tcW w:type="dxa" w:w="2880"/>
           </w:tcPr>
           <w:p>
+            <w:pPr>
+              <w:spacing w:line="360" w:lineRule="auto" w:before="0" w:after="0"/>
+              <w:ind w:firstLine="0"/>
+              <w:jc w:val="both"/>
+            </w:pPr>
             <w:r>
               <w:rPr>
-                <w:sz w:val="18"/>
+                <w:rFonts w:ascii="Times New Roman" w:hAnsi="Times New Roman" w:eastAsia="Times New Roman" w:cs="Times New Roman"/>
+                <w:b w:val="0"/>
+                <w:sz w:val="22"/>
               </w:rPr>
             </w:r>
           </w:p>
@@ -617,9 +927,16 @@
             <w:tcW w:type="dxa" w:w="2880"/>
           </w:tcPr>
           <w:p>
+            <w:pPr>
+              <w:spacing w:line="360" w:lineRule="auto" w:before="0" w:after="0"/>
+              <w:ind w:firstLine="0"/>
+              <w:jc w:val="both"/>
+            </w:pPr>
             <w:r>
               <w:rPr>
-                <w:sz w:val="18"/>
+                <w:rFonts w:ascii="Times New Roman" w:hAnsi="Times New Roman" w:eastAsia="Times New Roman" w:cs="Times New Roman"/>
+                <w:b w:val="0"/>
+                <w:sz w:val="22"/>
               </w:rPr>
             </w:r>
           </w:p>
@@ -629,9 +946,16 @@
             <w:tcW w:type="dxa" w:w="2880"/>
           </w:tcPr>
           <w:p>
+            <w:pPr>
+              <w:spacing w:line="360" w:lineRule="auto" w:before="0" w:after="0"/>
+              <w:ind w:firstLine="0"/>
+              <w:jc w:val="both"/>
+            </w:pPr>
             <w:r>
               <w:rPr>
-                <w:sz w:val="18"/>
+                <w:rFonts w:ascii="Times New Roman" w:hAnsi="Times New Roman" w:eastAsia="Times New Roman" w:cs="Times New Roman"/>
+                <w:b w:val="0"/>
+                <w:sz w:val="22"/>
               </w:rPr>
             </w:r>
           </w:p>
@@ -643,9 +967,16 @@
             <w:tcW w:type="dxa" w:w="2880"/>
           </w:tcPr>
           <w:p>
+            <w:pPr>
+              <w:spacing w:line="360" w:lineRule="auto" w:before="0" w:after="0"/>
+              <w:ind w:firstLine="0"/>
+              <w:jc w:val="both"/>
+            </w:pPr>
             <w:r>
               <w:rPr>
-                <w:sz w:val="18"/>
+                <w:rFonts w:ascii="Times New Roman" w:hAnsi="Times New Roman" w:eastAsia="Times New Roman" w:cs="Times New Roman"/>
+                <w:b w:val="0"/>
+                <w:sz w:val="22"/>
               </w:rPr>
             </w:r>
           </w:p>
@@ -655,9 +986,16 @@
             <w:tcW w:type="dxa" w:w="2880"/>
           </w:tcPr>
           <w:p>
+            <w:pPr>
+              <w:spacing w:line="360" w:lineRule="auto" w:before="0" w:after="0"/>
+              <w:ind w:firstLine="0"/>
+              <w:jc w:val="both"/>
+            </w:pPr>
             <w:r>
               <w:rPr>
-                <w:sz w:val="18"/>
+                <w:rFonts w:ascii="Times New Roman" w:hAnsi="Times New Roman" w:eastAsia="Times New Roman" w:cs="Times New Roman"/>
+                <w:b w:val="0"/>
+                <w:sz w:val="22"/>
               </w:rPr>
             </w:r>
           </w:p>
@@ -667,9 +1005,16 @@
             <w:tcW w:type="dxa" w:w="2880"/>
           </w:tcPr>
           <w:p>
+            <w:pPr>
+              <w:spacing w:line="360" w:lineRule="auto" w:before="0" w:after="0"/>
+              <w:ind w:firstLine="0"/>
+              <w:jc w:val="both"/>
+            </w:pPr>
             <w:r>
               <w:rPr>
-                <w:sz w:val="18"/>
+                <w:rFonts w:ascii="Times New Roman" w:hAnsi="Times New Roman" w:eastAsia="Times New Roman" w:cs="Times New Roman"/>
+                <w:b w:val="0"/>
+                <w:sz w:val="22"/>
               </w:rPr>
             </w:r>
           </w:p>
@@ -681,9 +1026,16 @@
             <w:tcW w:type="dxa" w:w="2880"/>
           </w:tcPr>
           <w:p>
+            <w:pPr>
+              <w:spacing w:line="360" w:lineRule="auto" w:before="0" w:after="0"/>
+              <w:ind w:firstLine="0"/>
+              <w:jc w:val="both"/>
+            </w:pPr>
             <w:r>
               <w:rPr>
-                <w:sz w:val="18"/>
+                <w:rFonts w:ascii="Times New Roman" w:hAnsi="Times New Roman" w:eastAsia="Times New Roman" w:cs="Times New Roman"/>
+                <w:b w:val="0"/>
+                <w:sz w:val="22"/>
               </w:rPr>
             </w:r>
           </w:p>
@@ -693,9 +1045,16 @@
             <w:tcW w:type="dxa" w:w="2880"/>
           </w:tcPr>
           <w:p>
+            <w:pPr>
+              <w:spacing w:line="360" w:lineRule="auto" w:before="0" w:after="0"/>
+              <w:ind w:firstLine="0"/>
+              <w:jc w:val="both"/>
+            </w:pPr>
             <w:r>
               <w:rPr>
-                <w:sz w:val="18"/>
+                <w:rFonts w:ascii="Times New Roman" w:hAnsi="Times New Roman" w:eastAsia="Times New Roman" w:cs="Times New Roman"/>
+                <w:b w:val="0"/>
+                <w:sz w:val="22"/>
               </w:rPr>
             </w:r>
           </w:p>
@@ -705,9 +1064,16 @@
             <w:tcW w:type="dxa" w:w="2880"/>
           </w:tcPr>
           <w:p>
+            <w:pPr>
+              <w:spacing w:line="360" w:lineRule="auto" w:before="0" w:after="0"/>
+              <w:ind w:firstLine="0"/>
+              <w:jc w:val="both"/>
+            </w:pPr>
             <w:r>
               <w:rPr>
-                <w:sz w:val="18"/>
+                <w:rFonts w:ascii="Times New Roman" w:hAnsi="Times New Roman" w:eastAsia="Times New Roman" w:cs="Times New Roman"/>
+                <w:b w:val="0"/>
+                <w:sz w:val="22"/>
               </w:rPr>
             </w:r>
           </w:p>
@@ -716,11 +1082,20 @@
     </w:tbl>
     <w:p/>
     <w:p>
+      <w:pPr>
+        <w:pStyle w:val="Heading2"/>
+        <w:keepNext/>
+        <w:keepLines/>
+        <w:spacing w:line="240" w:lineRule="auto" w:before="40" w:after="0"/>
+        <w:ind w:left="0" w:firstLine="0"/>
+        <w:jc w:val="left"/>
+      </w:pPr>
       <w:r>
         <w:rPr>
+          <w:rFonts w:ascii="Times New Roman" w:hAnsi="Times New Roman" w:eastAsia="Times New Roman" w:cs="Times New Roman"/>
           <w:b/>
           <w:i w:val="0"/>
-          <w:sz w:val="24"/>
+          <w:sz w:val="28"/>
         </w:rPr>
         <w:t>5. Бюджет и ресурсы</w:t>
       </w:r>
@@ -729,6 +1104,7 @@
       <w:tblPr>
         <w:tblStyle w:val="TableGrid"/>
         <w:tblW w:type="auto" w:w="0"/>
+        <w:tblLayout w:type="autofit"/>
         <w:tblLook w:firstColumn="1" w:firstRow="1" w:lastColumn="0" w:lastRow="0" w:noHBand="0" w:noVBand="1" w:val="04A0"/>
       </w:tblPr>
       <w:tblGrid>
@@ -742,10 +1118,16 @@
             <w:tcW w:type="dxa" w:w="2880"/>
           </w:tcPr>
           <w:p>
+            <w:pPr>
+              <w:spacing w:line="360" w:lineRule="auto" w:before="0" w:after="0"/>
+              <w:ind w:firstLine="0"/>
+              <w:jc w:val="center"/>
+            </w:pPr>
             <w:r>
               <w:rPr>
+                <w:rFonts w:ascii="Times New Roman" w:hAnsi="Times New Roman" w:eastAsia="Times New Roman" w:cs="Times New Roman"/>
                 <w:b/>
-                <w:sz w:val="18"/>
+                <w:sz w:val="22"/>
               </w:rPr>
               <w:t>Статья</w:t>
             </w:r>
@@ -756,10 +1138,16 @@
             <w:tcW w:type="dxa" w:w="2880"/>
           </w:tcPr>
           <w:p>
+            <w:pPr>
+              <w:spacing w:line="360" w:lineRule="auto" w:before="0" w:after="0"/>
+              <w:ind w:firstLine="0"/>
+              <w:jc w:val="center"/>
+            </w:pPr>
             <w:r>
               <w:rPr>
+                <w:rFonts w:ascii="Times New Roman" w:hAnsi="Times New Roman" w:eastAsia="Times New Roman" w:cs="Times New Roman"/>
                 <w:b/>
-                <w:sz w:val="18"/>
+                <w:sz w:val="22"/>
               </w:rPr>
               <w:t>Сумма, руб.</w:t>
             </w:r>
@@ -770,10 +1158,16 @@
             <w:tcW w:type="dxa" w:w="2880"/>
           </w:tcPr>
           <w:p>
+            <w:pPr>
+              <w:spacing w:line="360" w:lineRule="auto" w:before="0" w:after="0"/>
+              <w:ind w:firstLine="0"/>
+              <w:jc w:val="center"/>
+            </w:pPr>
             <w:r>
               <w:rPr>
+                <w:rFonts w:ascii="Times New Roman" w:hAnsi="Times New Roman" w:eastAsia="Times New Roman" w:cs="Times New Roman"/>
                 <w:b/>
-                <w:sz w:val="18"/>
+                <w:sz w:val="22"/>
               </w:rPr>
               <w:t>Комментарий</w:t>
             </w:r>
@@ -786,9 +1180,16 @@
             <w:tcW w:type="dxa" w:w="2880"/>
           </w:tcPr>
           <w:p>
+            <w:pPr>
+              <w:spacing w:line="360" w:lineRule="auto" w:before="0" w:after="0"/>
+              <w:ind w:firstLine="0"/>
+              <w:jc w:val="both"/>
+            </w:pPr>
             <w:r>
               <w:rPr>
-                <w:sz w:val="18"/>
+                <w:rFonts w:ascii="Times New Roman" w:hAnsi="Times New Roman" w:eastAsia="Times New Roman" w:cs="Times New Roman"/>
+                <w:b w:val="0"/>
+                <w:sz w:val="22"/>
               </w:rPr>
               <w:t>Оплата труда</w:t>
             </w:r>
@@ -799,9 +1200,16 @@
             <w:tcW w:type="dxa" w:w="2880"/>
           </w:tcPr>
           <w:p>
+            <w:pPr>
+              <w:spacing w:line="360" w:lineRule="auto" w:before="0" w:after="0"/>
+              <w:ind w:firstLine="0"/>
+              <w:jc w:val="both"/>
+            </w:pPr>
             <w:r>
               <w:rPr>
-                <w:sz w:val="18"/>
+                <w:rFonts w:ascii="Times New Roman" w:hAnsi="Times New Roman" w:eastAsia="Times New Roman" w:cs="Times New Roman"/>
+                <w:b w:val="0"/>
+                <w:sz w:val="22"/>
               </w:rPr>
             </w:r>
           </w:p>
@@ -811,9 +1219,16 @@
             <w:tcW w:type="dxa" w:w="2880"/>
           </w:tcPr>
           <w:p>
+            <w:pPr>
+              <w:spacing w:line="360" w:lineRule="auto" w:before="0" w:after="0"/>
+              <w:ind w:firstLine="0"/>
+              <w:jc w:val="both"/>
+            </w:pPr>
             <w:r>
               <w:rPr>
-                <w:sz w:val="18"/>
+                <w:rFonts w:ascii="Times New Roman" w:hAnsi="Times New Roman" w:eastAsia="Times New Roman" w:cs="Times New Roman"/>
+                <w:b w:val="0"/>
+                <w:sz w:val="22"/>
               </w:rPr>
             </w:r>
           </w:p>
@@ -825,9 +1240,16 @@
             <w:tcW w:type="dxa" w:w="2880"/>
           </w:tcPr>
           <w:p>
+            <w:pPr>
+              <w:spacing w:line="360" w:lineRule="auto" w:before="0" w:after="0"/>
+              <w:ind w:firstLine="0"/>
+              <w:jc w:val="both"/>
+            </w:pPr>
             <w:r>
               <w:rPr>
-                <w:sz w:val="18"/>
+                <w:rFonts w:ascii="Times New Roman" w:hAnsi="Times New Roman" w:eastAsia="Times New Roman" w:cs="Times New Roman"/>
+                <w:b w:val="0"/>
+                <w:sz w:val="22"/>
               </w:rPr>
               <w:t>Оборудование и ПО</w:t>
             </w:r>
@@ -838,9 +1260,16 @@
             <w:tcW w:type="dxa" w:w="2880"/>
           </w:tcPr>
           <w:p>
+            <w:pPr>
+              <w:spacing w:line="360" w:lineRule="auto" w:before="0" w:after="0"/>
+              <w:ind w:firstLine="0"/>
+              <w:jc w:val="both"/>
+            </w:pPr>
             <w:r>
               <w:rPr>
-                <w:sz w:val="18"/>
+                <w:rFonts w:ascii="Times New Roman" w:hAnsi="Times New Roman" w:eastAsia="Times New Roman" w:cs="Times New Roman"/>
+                <w:b w:val="0"/>
+                <w:sz w:val="22"/>
               </w:rPr>
             </w:r>
           </w:p>
@@ -850,9 +1279,16 @@
             <w:tcW w:type="dxa" w:w="2880"/>
           </w:tcPr>
           <w:p>
+            <w:pPr>
+              <w:spacing w:line="360" w:lineRule="auto" w:before="0" w:after="0"/>
+              <w:ind w:firstLine="0"/>
+              <w:jc w:val="both"/>
+            </w:pPr>
             <w:r>
               <w:rPr>
-                <w:sz w:val="18"/>
+                <w:rFonts w:ascii="Times New Roman" w:hAnsi="Times New Roman" w:eastAsia="Times New Roman" w:cs="Times New Roman"/>
+                <w:b w:val="0"/>
+                <w:sz w:val="22"/>
               </w:rPr>
             </w:r>
           </w:p>
@@ -864,9 +1300,16 @@
             <w:tcW w:type="dxa" w:w="2880"/>
           </w:tcPr>
           <w:p>
+            <w:pPr>
+              <w:spacing w:line="360" w:lineRule="auto" w:before="0" w:after="0"/>
+              <w:ind w:firstLine="0"/>
+              <w:jc w:val="both"/>
+            </w:pPr>
             <w:r>
               <w:rPr>
-                <w:sz w:val="18"/>
+                <w:rFonts w:ascii="Times New Roman" w:hAnsi="Times New Roman" w:eastAsia="Times New Roman" w:cs="Times New Roman"/>
+                <w:b w:val="0"/>
+                <w:sz w:val="22"/>
               </w:rPr>
               <w:t>Резерв</w:t>
             </w:r>
@@ -877,9 +1320,16 @@
             <w:tcW w:type="dxa" w:w="2880"/>
           </w:tcPr>
           <w:p>
+            <w:pPr>
+              <w:spacing w:line="360" w:lineRule="auto" w:before="0" w:after="0"/>
+              <w:ind w:firstLine="0"/>
+              <w:jc w:val="both"/>
+            </w:pPr>
             <w:r>
               <w:rPr>
-                <w:sz w:val="18"/>
+                <w:rFonts w:ascii="Times New Roman" w:hAnsi="Times New Roman" w:eastAsia="Times New Roman" w:cs="Times New Roman"/>
+                <w:b w:val="0"/>
+                <w:sz w:val="22"/>
               </w:rPr>
             </w:r>
           </w:p>
@@ -889,9 +1339,16 @@
             <w:tcW w:type="dxa" w:w="2880"/>
           </w:tcPr>
           <w:p>
+            <w:pPr>
+              <w:spacing w:line="360" w:lineRule="auto" w:before="0" w:after="0"/>
+              <w:ind w:firstLine="0"/>
+              <w:jc w:val="both"/>
+            </w:pPr>
             <w:r>
               <w:rPr>
-                <w:sz w:val="18"/>
+                <w:rFonts w:ascii="Times New Roman" w:hAnsi="Times New Roman" w:eastAsia="Times New Roman" w:cs="Times New Roman"/>
+                <w:b w:val="0"/>
+                <w:sz w:val="22"/>
               </w:rPr>
             </w:r>
           </w:p>
@@ -903,9 +1360,16 @@
             <w:tcW w:type="dxa" w:w="2880"/>
           </w:tcPr>
           <w:p>
+            <w:pPr>
+              <w:spacing w:line="360" w:lineRule="auto" w:before="0" w:after="0"/>
+              <w:ind w:firstLine="0"/>
+              <w:jc w:val="both"/>
+            </w:pPr>
             <w:r>
               <w:rPr>
-                <w:sz w:val="18"/>
+                <w:rFonts w:ascii="Times New Roman" w:hAnsi="Times New Roman" w:eastAsia="Times New Roman" w:cs="Times New Roman"/>
+                <w:b w:val="0"/>
+                <w:sz w:val="22"/>
               </w:rPr>
               <w:t>Итого</w:t>
             </w:r>
@@ -916,9 +1380,16 @@
             <w:tcW w:type="dxa" w:w="2880"/>
           </w:tcPr>
           <w:p>
+            <w:pPr>
+              <w:spacing w:line="360" w:lineRule="auto" w:before="0" w:after="0"/>
+              <w:ind w:firstLine="0"/>
+              <w:jc w:val="both"/>
+            </w:pPr>
             <w:r>
               <w:rPr>
-                <w:sz w:val="18"/>
+                <w:rFonts w:ascii="Times New Roman" w:hAnsi="Times New Roman" w:eastAsia="Times New Roman" w:cs="Times New Roman"/>
+                <w:b w:val="0"/>
+                <w:sz w:val="22"/>
               </w:rPr>
             </w:r>
           </w:p>
@@ -928,9 +1399,16 @@
             <w:tcW w:type="dxa" w:w="2880"/>
           </w:tcPr>
           <w:p>
+            <w:pPr>
+              <w:spacing w:line="360" w:lineRule="auto" w:before="0" w:after="0"/>
+              <w:ind w:firstLine="0"/>
+              <w:jc w:val="both"/>
+            </w:pPr>
             <w:r>
               <w:rPr>
-                <w:sz w:val="18"/>
+                <w:rFonts w:ascii="Times New Roman" w:hAnsi="Times New Roman" w:eastAsia="Times New Roman" w:cs="Times New Roman"/>
+                <w:b w:val="0"/>
+                <w:sz w:val="22"/>
               </w:rPr>
             </w:r>
           </w:p>
@@ -939,11 +1417,20 @@
     </w:tbl>
     <w:p/>
     <w:p>
+      <w:pPr>
+        <w:pStyle w:val="Heading2"/>
+        <w:keepNext/>
+        <w:keepLines/>
+        <w:spacing w:line="240" w:lineRule="auto" w:before="40" w:after="0"/>
+        <w:ind w:left="0" w:firstLine="0"/>
+        <w:jc w:val="left"/>
+      </w:pPr>
       <w:r>
         <w:rPr>
+          <w:rFonts w:ascii="Times New Roman" w:hAnsi="Times New Roman" w:eastAsia="Times New Roman" w:cs="Times New Roman"/>
           <w:b/>
           <w:i w:val="0"/>
-          <w:sz w:val="24"/>
+          <w:sz w:val="28"/>
         </w:rPr>
         <w:t>6. Ключевые риски и допущения</w:t>
       </w:r>
@@ -952,6 +1439,7 @@
       <w:tblPr>
         <w:tblStyle w:val="TableGrid"/>
         <w:tblW w:type="auto" w:w="0"/>
+        <w:tblLayout w:type="autofit"/>
         <w:tblLook w:firstColumn="1" w:firstRow="1" w:lastColumn="0" w:lastRow="0" w:noHBand="0" w:noVBand="1" w:val="04A0"/>
       </w:tblPr>
       <w:tblGrid>
@@ -965,10 +1453,16 @@
             <w:tcW w:type="dxa" w:w="2880"/>
           </w:tcPr>
           <w:p>
+            <w:pPr>
+              <w:spacing w:line="360" w:lineRule="auto" w:before="0" w:after="0"/>
+              <w:ind w:firstLine="0"/>
+              <w:jc w:val="center"/>
+            </w:pPr>
             <w:r>
               <w:rPr>
+                <w:rFonts w:ascii="Times New Roman" w:hAnsi="Times New Roman" w:eastAsia="Times New Roman" w:cs="Times New Roman"/>
                 <w:b/>
-                <w:sz w:val="18"/>
+                <w:sz w:val="22"/>
               </w:rPr>
               <w:t>Риск или допущение</w:t>
             </w:r>
@@ -979,10 +1473,16 @@
             <w:tcW w:type="dxa" w:w="2880"/>
           </w:tcPr>
           <w:p>
+            <w:pPr>
+              <w:spacing w:line="360" w:lineRule="auto" w:before="0" w:after="0"/>
+              <w:ind w:firstLine="0"/>
+              <w:jc w:val="center"/>
+            </w:pPr>
             <w:r>
               <w:rPr>
+                <w:rFonts w:ascii="Times New Roman" w:hAnsi="Times New Roman" w:eastAsia="Times New Roman" w:cs="Times New Roman"/>
                 <w:b/>
-                <w:sz w:val="18"/>
+                <w:sz w:val="22"/>
               </w:rPr>
               <w:t>Влияние</w:t>
             </w:r>
@@ -993,10 +1493,16 @@
             <w:tcW w:type="dxa" w:w="2880"/>
           </w:tcPr>
           <w:p>
+            <w:pPr>
+              <w:spacing w:line="360" w:lineRule="auto" w:before="0" w:after="0"/>
+              <w:ind w:firstLine="0"/>
+              <w:jc w:val="center"/>
+            </w:pPr>
             <w:r>
               <w:rPr>
+                <w:rFonts w:ascii="Times New Roman" w:hAnsi="Times New Roman" w:eastAsia="Times New Roman" w:cs="Times New Roman"/>
                 <w:b/>
-                <w:sz w:val="18"/>
+                <w:sz w:val="22"/>
               </w:rPr>
               <w:t>Что делаем</w:t>
             </w:r>
@@ -1009,9 +1515,16 @@
             <w:tcW w:type="dxa" w:w="2880"/>
           </w:tcPr>
           <w:p>
+            <w:pPr>
+              <w:spacing w:line="360" w:lineRule="auto" w:before="0" w:after="0"/>
+              <w:ind w:firstLine="0"/>
+              <w:jc w:val="both"/>
+            </w:pPr>
             <w:r>
               <w:rPr>
-                <w:sz w:val="18"/>
+                <w:rFonts w:ascii="Times New Roman" w:hAnsi="Times New Roman" w:eastAsia="Times New Roman" w:cs="Times New Roman"/>
+                <w:b w:val="0"/>
+                <w:sz w:val="22"/>
               </w:rPr>
             </w:r>
           </w:p>
@@ -1021,9 +1534,16 @@
             <w:tcW w:type="dxa" w:w="2880"/>
           </w:tcPr>
           <w:p>
+            <w:pPr>
+              <w:spacing w:line="360" w:lineRule="auto" w:before="0" w:after="0"/>
+              <w:ind w:firstLine="0"/>
+              <w:jc w:val="both"/>
+            </w:pPr>
             <w:r>
               <w:rPr>
-                <w:sz w:val="18"/>
+                <w:rFonts w:ascii="Times New Roman" w:hAnsi="Times New Roman" w:eastAsia="Times New Roman" w:cs="Times New Roman"/>
+                <w:b w:val="0"/>
+                <w:sz w:val="22"/>
               </w:rPr>
             </w:r>
           </w:p>
@@ -1033,9 +1553,16 @@
             <w:tcW w:type="dxa" w:w="2880"/>
           </w:tcPr>
           <w:p>
+            <w:pPr>
+              <w:spacing w:line="360" w:lineRule="auto" w:before="0" w:after="0"/>
+              <w:ind w:firstLine="0"/>
+              <w:jc w:val="both"/>
+            </w:pPr>
             <w:r>
               <w:rPr>
-                <w:sz w:val="18"/>
+                <w:rFonts w:ascii="Times New Roman" w:hAnsi="Times New Roman" w:eastAsia="Times New Roman" w:cs="Times New Roman"/>
+                <w:b w:val="0"/>
+                <w:sz w:val="22"/>
               </w:rPr>
             </w:r>
           </w:p>
@@ -1047,9 +1574,16 @@
             <w:tcW w:type="dxa" w:w="2880"/>
           </w:tcPr>
           <w:p>
+            <w:pPr>
+              <w:spacing w:line="360" w:lineRule="auto" w:before="0" w:after="0"/>
+              <w:ind w:firstLine="0"/>
+              <w:jc w:val="both"/>
+            </w:pPr>
             <w:r>
               <w:rPr>
-                <w:sz w:val="18"/>
+                <w:rFonts w:ascii="Times New Roman" w:hAnsi="Times New Roman" w:eastAsia="Times New Roman" w:cs="Times New Roman"/>
+                <w:b w:val="0"/>
+                <w:sz w:val="22"/>
               </w:rPr>
             </w:r>
           </w:p>
@@ -1059,9 +1593,16 @@
             <w:tcW w:type="dxa" w:w="2880"/>
           </w:tcPr>
           <w:p>
+            <w:pPr>
+              <w:spacing w:line="360" w:lineRule="auto" w:before="0" w:after="0"/>
+              <w:ind w:firstLine="0"/>
+              <w:jc w:val="both"/>
+            </w:pPr>
             <w:r>
               <w:rPr>
-                <w:sz w:val="18"/>
+                <w:rFonts w:ascii="Times New Roman" w:hAnsi="Times New Roman" w:eastAsia="Times New Roman" w:cs="Times New Roman"/>
+                <w:b w:val="0"/>
+                <w:sz w:val="22"/>
               </w:rPr>
             </w:r>
           </w:p>
@@ -1071,9 +1612,16 @@
             <w:tcW w:type="dxa" w:w="2880"/>
           </w:tcPr>
           <w:p>
+            <w:pPr>
+              <w:spacing w:line="360" w:lineRule="auto" w:before="0" w:after="0"/>
+              <w:ind w:firstLine="0"/>
+              <w:jc w:val="both"/>
+            </w:pPr>
             <w:r>
               <w:rPr>
-                <w:sz w:val="18"/>
+                <w:rFonts w:ascii="Times New Roman" w:hAnsi="Times New Roman" w:eastAsia="Times New Roman" w:cs="Times New Roman"/>
+                <w:b w:val="0"/>
+                <w:sz w:val="22"/>
               </w:rPr>
             </w:r>
           </w:p>
@@ -1085,9 +1633,16 @@
             <w:tcW w:type="dxa" w:w="2880"/>
           </w:tcPr>
           <w:p>
+            <w:pPr>
+              <w:spacing w:line="360" w:lineRule="auto" w:before="0" w:after="0"/>
+              <w:ind w:firstLine="0"/>
+              <w:jc w:val="both"/>
+            </w:pPr>
             <w:r>
               <w:rPr>
-                <w:sz w:val="18"/>
+                <w:rFonts w:ascii="Times New Roman" w:hAnsi="Times New Roman" w:eastAsia="Times New Roman" w:cs="Times New Roman"/>
+                <w:b w:val="0"/>
+                <w:sz w:val="22"/>
               </w:rPr>
             </w:r>
           </w:p>
@@ -1097,9 +1652,16 @@
             <w:tcW w:type="dxa" w:w="2880"/>
           </w:tcPr>
           <w:p>
+            <w:pPr>
+              <w:spacing w:line="360" w:lineRule="auto" w:before="0" w:after="0"/>
+              <w:ind w:firstLine="0"/>
+              <w:jc w:val="both"/>
+            </w:pPr>
             <w:r>
               <w:rPr>
-                <w:sz w:val="18"/>
+                <w:rFonts w:ascii="Times New Roman" w:hAnsi="Times New Roman" w:eastAsia="Times New Roman" w:cs="Times New Roman"/>
+                <w:b w:val="0"/>
+                <w:sz w:val="22"/>
               </w:rPr>
             </w:r>
           </w:p>
@@ -1109,9 +1671,16 @@
             <w:tcW w:type="dxa" w:w="2880"/>
           </w:tcPr>
           <w:p>
+            <w:pPr>
+              <w:spacing w:line="360" w:lineRule="auto" w:before="0" w:after="0"/>
+              <w:ind w:firstLine="0"/>
+              <w:jc w:val="both"/>
+            </w:pPr>
             <w:r>
               <w:rPr>
-                <w:sz w:val="18"/>
+                <w:rFonts w:ascii="Times New Roman" w:hAnsi="Times New Roman" w:eastAsia="Times New Roman" w:cs="Times New Roman"/>
+                <w:b w:val="0"/>
+                <w:sz w:val="22"/>
               </w:rPr>
             </w:r>
           </w:p>
@@ -1120,102 +1689,171 @@
     </w:tbl>
     <w:p/>
     <w:p>
+      <w:pPr>
+        <w:pStyle w:val="Heading2"/>
+        <w:keepNext/>
+        <w:keepLines/>
+        <w:spacing w:line="240" w:lineRule="auto" w:before="40" w:after="0"/>
+        <w:ind w:left="0" w:firstLine="0"/>
+        <w:jc w:val="left"/>
+      </w:pPr>
       <w:r>
         <w:rPr>
+          <w:rFonts w:ascii="Times New Roman" w:hAnsi="Times New Roman" w:eastAsia="Times New Roman" w:cs="Times New Roman"/>
           <w:b/>
           <w:i w:val="0"/>
-          <w:sz w:val="24"/>
+          <w:sz w:val="28"/>
         </w:rPr>
         <w:t>7. Полномочия и подписи</w:t>
       </w:r>
     </w:p>
     <w:p>
+      <w:pPr>
+        <w:spacing w:line="360" w:lineRule="auto" w:before="0" w:after="0"/>
+        <w:ind w:firstLine="709"/>
+        <w:jc w:val="both"/>
+      </w:pPr>
       <w:r>
         <w:rPr>
+          <w:rFonts w:ascii="Times New Roman" w:hAnsi="Times New Roman" w:eastAsia="Times New Roman" w:cs="Times New Roman"/>
           <w:b w:val="0"/>
           <w:i w:val="0"/>
-          <w:sz w:val="24"/>
+          <w:sz w:val="28"/>
         </w:rPr>
         <w:t>Руководитель проекта имеет право: ______________________________________</w:t>
       </w:r>
     </w:p>
     <w:p>
+      <w:pPr>
+        <w:spacing w:line="360" w:lineRule="auto" w:before="0" w:after="0"/>
+        <w:ind w:firstLine="709"/>
+        <w:jc w:val="both"/>
+      </w:pPr>
       <w:r>
         <w:rPr>
+          <w:rFonts w:ascii="Times New Roman" w:hAnsi="Times New Roman" w:eastAsia="Times New Roman" w:cs="Times New Roman"/>
           <w:b w:val="0"/>
           <w:i w:val="0"/>
-          <w:sz w:val="24"/>
+          <w:sz w:val="28"/>
         </w:rPr>
         <w:t>Спонсор подтверждает цель, бюджет и срок: ____________________ / __________</w:t>
       </w:r>
     </w:p>
     <w:p>
+      <w:pPr>
+        <w:pStyle w:val="Heading1"/>
+        <w:keepNext/>
+        <w:keepLines/>
+        <w:spacing w:line="240" w:lineRule="auto" w:before="240" w:after="0"/>
+        <w:ind w:left="0" w:firstLine="0"/>
+        <w:jc w:val="both"/>
+      </w:pPr>
       <w:r>
         <w:rPr>
-          <w:b/>
+          <w:rFonts w:ascii="Times New Roman" w:hAnsi="Times New Roman" w:eastAsia="Times New Roman" w:cs="Times New Roman"/>
+          <w:b w:val="0"/>
           <w:i w:val="0"/>
-          <w:sz w:val="24"/>
+          <w:sz w:val="28"/>
         </w:rPr>
         <w:t>Контрольные вопросы</w:t>
       </w:r>
     </w:p>
     <w:p>
+      <w:pPr>
+        <w:spacing w:line="360" w:lineRule="auto" w:before="0" w:after="0"/>
+        <w:ind w:firstLine="709"/>
+        <w:jc w:val="both"/>
+      </w:pPr>
       <w:r>
         <w:rPr>
+          <w:rFonts w:ascii="Times New Roman" w:hAnsi="Times New Roman" w:eastAsia="Times New Roman" w:cs="Times New Roman"/>
           <w:b w:val="0"/>
           <w:i w:val="0"/>
-          <w:sz w:val="24"/>
+          <w:sz w:val="28"/>
         </w:rPr>
         <w:t>1. Чем цель проекта отличается от его результата?</w:t>
       </w:r>
     </w:p>
     <w:p>
+      <w:pPr>
+        <w:spacing w:line="360" w:lineRule="auto" w:before="0" w:after="0"/>
+        <w:ind w:firstLine="709"/>
+        <w:jc w:val="both"/>
+      </w:pPr>
       <w:r>
         <w:rPr>
+          <w:rFonts w:ascii="Times New Roman" w:hAnsi="Times New Roman" w:eastAsia="Times New Roman" w:cs="Times New Roman"/>
           <w:b w:val="0"/>
           <w:i w:val="0"/>
-          <w:sz w:val="24"/>
+          <w:sz w:val="28"/>
         </w:rPr>
         <w:t>2. Почему границы проекта записывают отдельным списком?</w:t>
       </w:r>
     </w:p>
     <w:p>
+      <w:pPr>
+        <w:spacing w:line="360" w:lineRule="auto" w:before="0" w:after="0"/>
+        <w:ind w:firstLine="709"/>
+        <w:jc w:val="both"/>
+      </w:pPr>
       <w:r>
         <w:rPr>
+          <w:rFonts w:ascii="Times New Roman" w:hAnsi="Times New Roman" w:eastAsia="Times New Roman" w:cs="Times New Roman"/>
           <w:b w:val="0"/>
           <w:i w:val="0"/>
-          <w:sz w:val="24"/>
+          <w:sz w:val="28"/>
         </w:rPr>
         <w:t>3. Какая веха доказывает, что проект готов к приёмке?</w:t>
       </w:r>
     </w:p>
     <w:p>
+      <w:pPr>
+        <w:spacing w:line="360" w:lineRule="auto" w:before="0" w:after="0"/>
+        <w:ind w:firstLine="709"/>
+        <w:jc w:val="both"/>
+      </w:pPr>
       <w:r>
         <w:rPr>
+          <w:rFonts w:ascii="Times New Roman" w:hAnsi="Times New Roman" w:eastAsia="Times New Roman" w:cs="Times New Roman"/>
           <w:b w:val="0"/>
           <w:i w:val="0"/>
-          <w:sz w:val="24"/>
+          <w:sz w:val="28"/>
         </w:rPr>
         <w:t>4. Что произойдёт, если в уставе нет критерия готовности?</w:t>
       </w:r>
     </w:p>
     <w:p>
+      <w:pPr>
+        <w:spacing w:line="360" w:lineRule="auto" w:before="0" w:after="0"/>
+        <w:ind w:firstLine="709"/>
+        <w:jc w:val="both"/>
+      </w:pPr>
       <w:r>
         <w:rPr>
+          <w:rFonts w:ascii="Times New Roman" w:hAnsi="Times New Roman" w:eastAsia="Times New Roman" w:cs="Times New Roman"/>
           <w:b w:val="0"/>
           <w:i w:val="0"/>
-          <w:sz w:val="24"/>
+          <w:sz w:val="28"/>
         </w:rPr>
         <w:t>5. Кто имеет право остановить проект и на каком основании?</w:t>
       </w:r>
     </w:p>
     <w:p/>
     <w:p>
+      <w:pPr>
+        <w:pStyle w:val="Heading1"/>
+        <w:keepNext/>
+        <w:keepLines/>
+        <w:spacing w:line="240" w:lineRule="auto" w:before="240" w:after="0"/>
+        <w:ind w:left="0" w:firstLine="0"/>
+        <w:jc w:val="both"/>
+      </w:pPr>
       <w:r>
         <w:rPr>
-          <w:b/>
+          <w:rFonts w:ascii="Times New Roman" w:hAnsi="Times New Roman" w:eastAsia="Times New Roman" w:cs="Times New Roman"/>
+          <w:b w:val="0"/>
           <w:i w:val="0"/>
-          <w:sz w:val="24"/>
+          <w:sz w:val="28"/>
         </w:rPr>
         <w:t>Критерии оценки</w:t>
       </w:r>
@@ -1224,6 +1862,7 @@
       <w:tblPr>
         <w:tblStyle w:val="TableGrid"/>
         <w:tblW w:type="auto" w:w="0"/>
+        <w:tblLayout w:type="autofit"/>
         <w:tblLook w:firstColumn="1" w:firstRow="1" w:lastColumn="0" w:lastRow="0" w:noHBand="0" w:noVBand="1" w:val="04A0"/>
       </w:tblPr>
       <w:tblGrid>
@@ -1236,10 +1875,16 @@
             <w:tcW w:type="dxa" w:w="4320"/>
           </w:tcPr>
           <w:p>
+            <w:pPr>
+              <w:spacing w:line="360" w:lineRule="auto" w:before="0" w:after="0"/>
+              <w:ind w:firstLine="0"/>
+              <w:jc w:val="center"/>
+            </w:pPr>
             <w:r>
               <w:rPr>
+                <w:rFonts w:ascii="Times New Roman" w:hAnsi="Times New Roman" w:eastAsia="Times New Roman" w:cs="Times New Roman"/>
                 <w:b/>
-                <w:sz w:val="18"/>
+                <w:sz w:val="22"/>
               </w:rPr>
               <w:t>Балл</w:t>
             </w:r>
@@ -1250,10 +1895,16 @@
             <w:tcW w:type="dxa" w:w="4320"/>
           </w:tcPr>
           <w:p>
+            <w:pPr>
+              <w:spacing w:line="360" w:lineRule="auto" w:before="0" w:after="0"/>
+              <w:ind w:firstLine="0"/>
+              <w:jc w:val="center"/>
+            </w:pPr>
             <w:r>
               <w:rPr>
+                <w:rFonts w:ascii="Times New Roman" w:hAnsi="Times New Roman" w:eastAsia="Times New Roman" w:cs="Times New Roman"/>
                 <w:b/>
-                <w:sz w:val="18"/>
+                <w:sz w:val="22"/>
               </w:rPr>
               <w:t>Что должно быть сделано</w:t>
             </w:r>
@@ -1266,9 +1917,16 @@
             <w:tcW w:type="dxa" w:w="4320"/>
           </w:tcPr>
           <w:p>
+            <w:pPr>
+              <w:spacing w:line="360" w:lineRule="auto" w:before="0" w:after="0"/>
+              <w:ind w:firstLine="0"/>
+              <w:jc w:val="both"/>
+            </w:pPr>
             <w:r>
               <w:rPr>
-                <w:sz w:val="18"/>
+                <w:rFonts w:ascii="Times New Roman" w:hAnsi="Times New Roman" w:eastAsia="Times New Roman" w:cs="Times New Roman"/>
+                <w:b w:val="0"/>
+                <w:sz w:val="22"/>
               </w:rPr>
               <w:t>5</w:t>
             </w:r>
@@ -1279,9 +1937,16 @@
             <w:tcW w:type="dxa" w:w="4320"/>
           </w:tcPr>
           <w:p>
+            <w:pPr>
+              <w:spacing w:line="360" w:lineRule="auto" w:before="0" w:after="0"/>
+              <w:ind w:firstLine="0"/>
+              <w:jc w:val="both"/>
+            </w:pPr>
             <w:r>
               <w:rPr>
-                <w:sz w:val="18"/>
+                <w:rFonts w:ascii="Times New Roman" w:hAnsi="Times New Roman" w:eastAsia="Times New Roman" w:cs="Times New Roman"/>
+                <w:b w:val="0"/>
+                <w:sz w:val="22"/>
               </w:rPr>
               <w:t>Все семь разделов заполнены, цель измерима, границы непротиворечивы, бюджет сходится, риски имеют меры.</w:t>
             </w:r>
@@ -1294,9 +1959,16 @@
             <w:tcW w:type="dxa" w:w="4320"/>
           </w:tcPr>
           <w:p>
+            <w:pPr>
+              <w:spacing w:line="360" w:lineRule="auto" w:before="0" w:after="0"/>
+              <w:ind w:firstLine="0"/>
+              <w:jc w:val="both"/>
+            </w:pPr>
             <w:r>
               <w:rPr>
-                <w:sz w:val="18"/>
+                <w:rFonts w:ascii="Times New Roman" w:hAnsi="Times New Roman" w:eastAsia="Times New Roman" w:cs="Times New Roman"/>
+                <w:b w:val="0"/>
+                <w:sz w:val="22"/>
               </w:rPr>
               <w:t>4</w:t>
             </w:r>
@@ -1307,9 +1979,16 @@
             <w:tcW w:type="dxa" w:w="4320"/>
           </w:tcPr>
           <w:p>
+            <w:pPr>
+              <w:spacing w:line="360" w:lineRule="auto" w:before="0" w:after="0"/>
+              <w:ind w:firstLine="0"/>
+              <w:jc w:val="both"/>
+            </w:pPr>
             <w:r>
               <w:rPr>
-                <w:sz w:val="18"/>
+                <w:rFonts w:ascii="Times New Roman" w:hAnsi="Times New Roman" w:eastAsia="Times New Roman" w:cs="Times New Roman"/>
+                <w:b w:val="0"/>
+                <w:sz w:val="22"/>
               </w:rPr>
               <w:t>Разделы заполнены, есть одна неточность в цели или границах, бюджет сходится.</w:t>
             </w:r>
@@ -1322,9 +2001,16 @@
             <w:tcW w:type="dxa" w:w="4320"/>
           </w:tcPr>
           <w:p>
+            <w:pPr>
+              <w:spacing w:line="360" w:lineRule="auto" w:before="0" w:after="0"/>
+              <w:ind w:firstLine="0"/>
+              <w:jc w:val="both"/>
+            </w:pPr>
             <w:r>
               <w:rPr>
-                <w:sz w:val="18"/>
+                <w:rFonts w:ascii="Times New Roman" w:hAnsi="Times New Roman" w:eastAsia="Times New Roman" w:cs="Times New Roman"/>
+                <w:b w:val="0"/>
+                <w:sz w:val="22"/>
               </w:rPr>
               <w:t>3</w:t>
             </w:r>
@@ -1335,9 +2021,16 @@
             <w:tcW w:type="dxa" w:w="4320"/>
           </w:tcPr>
           <w:p>
+            <w:pPr>
+              <w:spacing w:line="360" w:lineRule="auto" w:before="0" w:after="0"/>
+              <w:ind w:firstLine="0"/>
+              <w:jc w:val="both"/>
+            </w:pPr>
             <w:r>
               <w:rPr>
-                <w:sz w:val="18"/>
+                <w:rFonts w:ascii="Times New Roman" w:hAnsi="Times New Roman" w:eastAsia="Times New Roman" w:cs="Times New Roman"/>
+                <w:b w:val="0"/>
+                <w:sz w:val="22"/>
               </w:rPr>
               <w:t>Заполнены основные разделы, границы размыты или нет критериев готовности.</w:t>
             </w:r>
@@ -1347,48 +2040,75 @@
     </w:tbl>
     <w:p/>
     <w:p>
+      <w:pPr>
+        <w:pStyle w:val="Heading1"/>
+        <w:keepNext/>
+        <w:keepLines/>
+        <w:spacing w:line="240" w:lineRule="auto" w:before="240" w:after="0"/>
+        <w:ind w:left="0" w:firstLine="0"/>
+        <w:jc w:val="both"/>
+      </w:pPr>
       <w:r>
         <w:rPr>
-          <w:b/>
+          <w:rFonts w:ascii="Times New Roman" w:hAnsi="Times New Roman" w:eastAsia="Times New Roman" w:cs="Times New Roman"/>
+          <w:b w:val="0"/>
           <w:i w:val="0"/>
-          <w:sz w:val="24"/>
+          <w:sz w:val="28"/>
         </w:rPr>
         <w:t>Вывод</w:t>
       </w:r>
     </w:p>
     <w:p>
+      <w:pPr>
+        <w:spacing w:line="360" w:lineRule="auto" w:before="0" w:after="0"/>
+        <w:ind w:firstLine="709"/>
+        <w:jc w:val="both"/>
+      </w:pPr>
       <w:r>
         <w:rPr>
+          <w:rFonts w:ascii="Times New Roman" w:hAnsi="Times New Roman" w:eastAsia="Times New Roman" w:cs="Times New Roman"/>
           <w:b w:val="0"/>
           <w:i w:val="0"/>
-          <w:sz w:val="24"/>
+          <w:sz w:val="28"/>
         </w:rPr>
         <w:t>________________________________________________________________________</w:t>
       </w:r>
     </w:p>
     <w:p>
+      <w:pPr>
+        <w:spacing w:line="360" w:lineRule="auto" w:before="0" w:after="0"/>
+        <w:ind w:firstLine="709"/>
+        <w:jc w:val="both"/>
+      </w:pPr>
       <w:r>
         <w:rPr>
+          <w:rFonts w:ascii="Times New Roman" w:hAnsi="Times New Roman" w:eastAsia="Times New Roman" w:cs="Times New Roman"/>
           <w:b w:val="0"/>
           <w:i w:val="0"/>
-          <w:sz w:val="24"/>
+          <w:sz w:val="28"/>
         </w:rPr>
         <w:t>________________________________________________________________________</w:t>
       </w:r>
     </w:p>
     <w:p>
+      <w:pPr>
+        <w:spacing w:line="360" w:lineRule="auto" w:before="0" w:after="0"/>
+        <w:ind w:firstLine="709"/>
+        <w:jc w:val="both"/>
+      </w:pPr>
       <w:r>
         <w:rPr>
+          <w:rFonts w:ascii="Times New Roman" w:hAnsi="Times New Roman" w:eastAsia="Times New Roman" w:cs="Times New Roman"/>
           <w:b w:val="0"/>
           <w:i w:val="0"/>
-          <w:sz w:val="24"/>
+          <w:sz w:val="28"/>
         </w:rPr>
         <w:t>________________________________________________________________________</w:t>
       </w:r>
     </w:p>
     <w:sectPr>
-      <w:pgSz w:w="12240" w:h="15840"/>
-      <w:pgMar w:top="1440" w:right="1800" w:bottom="1440" w:left="1800" w:header="720" w:footer="720" w:gutter="0"/>
+      <w:pgSz w:w="11906" w:h="16838"/>
+      <w:pgMar w:top="1134" w:right="850" w:bottom="1134" w:left="1701" w:header="720" w:footer="720" w:gutter="0"/>
       <w:cols w:space="720"/>
       <w:docGrid w:linePitch="360"/>
     </w:sectPr>
@@ -1759,9 +2479,14 @@
     <w:name w:val="Normal"/>
     <w:qFormat/>
     <w:rsid w:val="00FC693F"/>
+    <w:pPr>
+      <w:spacing w:line="360" w:lineRule="auto" w:before="0" w:after="0"/>
+      <w:ind w:firstLine="709"/>
+      <w:jc w:val="both"/>
+    </w:pPr>
     <w:rPr>
-      <w:rFonts w:ascii="Times New Roman" w:hAnsi="Times New Roman"/>
-      <w:sz w:val="24"/>
+      <w:rFonts w:ascii="Times New Roman" w:hAnsi="Times New Roman" w:eastAsia="Times New Roman" w:cs="Times New Roman"/>
+      <w:sz w:val="28"/>
     </w:rPr>
   </w:style>
   <w:style w:type="paragraph" w:styleId="Header">
@@ -1819,12 +2544,14 @@
     <w:pPr>
       <w:keepNext/>
       <w:keepLines/>
-      <w:spacing w:before="480" w:after="0"/>
+      <w:spacing w:before="240" w:after="0" w:line="240" w:lineRule="auto"/>
+      <w:ind w:left="0" w:firstLine="0"/>
+      <w:jc w:val="both"/>
       <w:outlineLvl w:val="0"/>
     </w:pPr>
     <w:rPr>
-      <w:rFonts w:asciiTheme="majorHAnsi" w:eastAsiaTheme="majorEastAsia" w:hAnsiTheme="majorHAnsi" w:cstheme="majorBidi"/>
-      <w:b/>
+      <w:rFonts w:asciiTheme="majorHAnsi" w:eastAsiaTheme="majorEastAsia" w:hAnsiTheme="majorHAnsi" w:cstheme="majorBidi" w:ascii="Times New Roman" w:hAnsi="Times New Roman" w:eastAsia="Times New Roman" w:cs="Times New Roman"/>
+      <w:b w:val="0"/>
       <w:bCs/>
       <w:color w:val="365F91" w:themeColor="accent1" w:themeShade="BF"/>
       <w:sz w:val="28"/>
@@ -1843,15 +2570,17 @@
     <w:pPr>
       <w:keepNext/>
       <w:keepLines/>
-      <w:spacing w:before="200" w:after="0"/>
+      <w:spacing w:before="40" w:after="0" w:line="240" w:lineRule="auto"/>
+      <w:ind w:left="0" w:firstLine="0"/>
+      <w:jc w:val="left"/>
       <w:outlineLvl w:val="1"/>
     </w:pPr>
     <w:rPr>
-      <w:rFonts w:asciiTheme="majorHAnsi" w:eastAsiaTheme="majorEastAsia" w:hAnsiTheme="majorHAnsi" w:cstheme="majorBidi"/>
+      <w:rFonts w:asciiTheme="majorHAnsi" w:eastAsiaTheme="majorEastAsia" w:hAnsiTheme="majorHAnsi" w:cstheme="majorBidi" w:ascii="Times New Roman" w:hAnsi="Times New Roman" w:eastAsia="Times New Roman" w:cs="Times New Roman"/>
       <w:b/>
       <w:bCs/>
       <w:color w:val="4F81BD" w:themeColor="accent1"/>
-      <w:sz w:val="26"/>
+      <w:sz w:val="28"/>
       <w:szCs w:val="26"/>
     </w:rPr>
   </w:style>
@@ -2181,9 +2910,14 @@
     <w:qFormat/>
     <w:rsid w:val="00FC693F"/>
     <w:pPr>
-      <w:ind w:left="720"/>
+      <w:spacing w:line="360" w:lineRule="auto" w:before="0" w:after="0"/>
+      <w:ind w:left="709" w:firstLine="0"/>
       <w:contextualSpacing/>
     </w:pPr>
+    <w:rPr>
+      <w:rFonts w:ascii="Times New Roman" w:hAnsi="Times New Roman" w:eastAsia="Times New Roman" w:cs="Times New Roman"/>
+      <w:sz w:val="28"/>
+    </w:rPr>
   </w:style>
   <w:style w:type="paragraph" w:styleId="BodyText">
     <w:name w:val="Body Text"/>

</xml_diff>

<commit_message>
Replace step checkboxes with a work checklist and refine DOCX formatting
</commit_message>
<xml_diff>
--- a/courses/3/project-management/dist/reports/PM_practice-01_charter-template.docx
+++ b/courses/3/project-management/dist/reports/PM_practice-01_charter-template.docx
@@ -13,6 +13,7 @@
           <w:rFonts w:ascii="Times New Roman" w:hAnsi="Times New Roman" w:eastAsia="Times New Roman" w:cs="Times New Roman"/>
           <w:b/>
           <w:i w:val="0"/>
+          <w:color w:val="000000"/>
           <w:sz w:val="28"/>
         </w:rPr>
         <w:t>Управление проектами (МДК.03.02)</w:t>
@@ -29,6 +30,7 @@
           <w:rFonts w:ascii="Times New Roman" w:hAnsi="Times New Roman" w:eastAsia="Times New Roman" w:cs="Times New Roman"/>
           <w:b/>
           <w:i w:val="0"/>
+          <w:color w:val="000000"/>
           <w:sz w:val="28"/>
         </w:rPr>
         <w:t>Практическая работа 1</w:t>
@@ -45,6 +47,7 @@
           <w:rFonts w:ascii="Times New Roman" w:hAnsi="Times New Roman" w:eastAsia="Times New Roman" w:cs="Times New Roman"/>
           <w:b w:val="0"/>
           <w:i w:val="0"/>
+          <w:color w:val="000000"/>
           <w:sz w:val="28"/>
         </w:rPr>
         <w:t>Устав проекта</w:t>
@@ -62,6 +65,7 @@
           <w:rFonts w:ascii="Times New Roman" w:hAnsi="Times New Roman" w:eastAsia="Times New Roman" w:cs="Times New Roman"/>
           <w:b w:val="0"/>
           <w:i w:val="0"/>
+          <w:color w:val="000000"/>
           <w:sz w:val="28"/>
         </w:rPr>
         <w:t>ФИО студента: ______________________________________</w:t>
@@ -78,6 +82,7 @@
           <w:rFonts w:ascii="Times New Roman" w:hAnsi="Times New Roman" w:eastAsia="Times New Roman" w:cs="Times New Roman"/>
           <w:b w:val="0"/>
           <w:i w:val="0"/>
+          <w:color w:val="000000"/>
           <w:sz w:val="28"/>
         </w:rPr>
         <w:t>Группа: ______________________  Дата: _______________</w:t>
@@ -94,6 +99,7 @@
           <w:rFonts w:ascii="Times New Roman" w:hAnsi="Times New Roman" w:eastAsia="Times New Roman" w:cs="Times New Roman"/>
           <w:b w:val="0"/>
           <w:i w:val="0"/>
+          <w:color w:val="000000"/>
           <w:sz w:val="28"/>
         </w:rPr>
         <w:t>Проект: ____________________________________________</w:t>
@@ -105,6 +111,7 @@
         <w:pStyle w:val="Heading1"/>
         <w:keepNext/>
         <w:keepLines/>
+        <w:pageBreakBefore/>
         <w:spacing w:line="240" w:lineRule="auto" w:before="240" w:after="0"/>
         <w:ind w:left="0" w:firstLine="0"/>
         <w:jc w:val="both"/>
@@ -114,6 +121,7 @@
           <w:rFonts w:ascii="Times New Roman" w:hAnsi="Times New Roman" w:eastAsia="Times New Roman" w:cs="Times New Roman"/>
           <w:b w:val="0"/>
           <w:i w:val="0"/>
+          <w:color w:val="000000"/>
           <w:sz w:val="28"/>
         </w:rPr>
         <w:t>Цель работы</w:t>
@@ -130,6 +138,7 @@
           <w:rFonts w:ascii="Times New Roman" w:hAnsi="Times New Roman" w:eastAsia="Times New Roman" w:cs="Times New Roman"/>
           <w:b w:val="0"/>
           <w:i w:val="0"/>
+          <w:color w:val="000000"/>
           <w:sz w:val="28"/>
         </w:rPr>
         <w:t>Собрать и проверить проектный документ так, чтобы его мог понять новый участник команды и комиссия. Все решения должны опираться на числа и проверяемые факты.</w:t>
@@ -149,6 +158,7 @@
         <w:rPr>
           <w:rFonts w:ascii="Times New Roman" w:hAnsi="Times New Roman" w:eastAsia="Times New Roman" w:cs="Times New Roman"/>
           <w:b w:val="0"/>
+          <w:color w:val="000000"/>
           <w:sz w:val="28"/>
         </w:rPr>
         <w:t>Ход работы</w:t>
@@ -168,6 +178,7 @@
           <w:rFonts w:ascii="Times New Roman" w:hAnsi="Times New Roman" w:eastAsia="Times New Roman" w:cs="Times New Roman"/>
           <w:b/>
           <w:i w:val="0"/>
+          <w:color w:val="000000"/>
           <w:sz w:val="28"/>
         </w:rPr>
         <w:t>1. Общие сведения</w:t>
@@ -199,6 +210,7 @@
               <w:rPr>
                 <w:rFonts w:ascii="Times New Roman" w:hAnsi="Times New Roman" w:eastAsia="Times New Roman" w:cs="Times New Roman"/>
                 <w:b/>
+                <w:color w:val="000000"/>
                 <w:sz w:val="22"/>
               </w:rPr>
               <w:t>Поле</w:t>
@@ -219,6 +231,7 @@
               <w:rPr>
                 <w:rFonts w:ascii="Times New Roman" w:hAnsi="Times New Roman" w:eastAsia="Times New Roman" w:cs="Times New Roman"/>
                 <w:b/>
+                <w:color w:val="000000"/>
                 <w:sz w:val="22"/>
               </w:rPr>
               <w:t>Значение</w:t>
@@ -241,6 +254,7 @@
               <w:rPr>
                 <w:rFonts w:ascii="Times New Roman" w:hAnsi="Times New Roman" w:eastAsia="Times New Roman" w:cs="Times New Roman"/>
                 <w:b w:val="0"/>
+                <w:color w:val="000000"/>
                 <w:sz w:val="22"/>
               </w:rPr>
               <w:t>Название проекта</w:t>
@@ -261,6 +275,7 @@
               <w:rPr>
                 <w:rFonts w:ascii="Times New Roman" w:hAnsi="Times New Roman" w:eastAsia="Times New Roman" w:cs="Times New Roman"/>
                 <w:b w:val="0"/>
+                <w:color w:val="000000"/>
                 <w:sz w:val="22"/>
               </w:rPr>
             </w:r>
@@ -282,6 +297,7 @@
               <w:rPr>
                 <w:rFonts w:ascii="Times New Roman" w:hAnsi="Times New Roman" w:eastAsia="Times New Roman" w:cs="Times New Roman"/>
                 <w:b w:val="0"/>
+                <w:color w:val="000000"/>
                 <w:sz w:val="22"/>
               </w:rPr>
               <w:t>Заказчик</w:t>
@@ -302,6 +318,7 @@
               <w:rPr>
                 <w:rFonts w:ascii="Times New Roman" w:hAnsi="Times New Roman" w:eastAsia="Times New Roman" w:cs="Times New Roman"/>
                 <w:b w:val="0"/>
+                <w:color w:val="000000"/>
                 <w:sz w:val="22"/>
               </w:rPr>
             </w:r>
@@ -323,6 +340,7 @@
               <w:rPr>
                 <w:rFonts w:ascii="Times New Roman" w:hAnsi="Times New Roman" w:eastAsia="Times New Roman" w:cs="Times New Roman"/>
                 <w:b w:val="0"/>
+                <w:color w:val="000000"/>
                 <w:sz w:val="22"/>
               </w:rPr>
               <w:t>Спонсор</w:t>
@@ -343,6 +361,7 @@
               <w:rPr>
                 <w:rFonts w:ascii="Times New Roman" w:hAnsi="Times New Roman" w:eastAsia="Times New Roman" w:cs="Times New Roman"/>
                 <w:b w:val="0"/>
+                <w:color w:val="000000"/>
                 <w:sz w:val="22"/>
               </w:rPr>
             </w:r>
@@ -364,6 +383,7 @@
               <w:rPr>
                 <w:rFonts w:ascii="Times New Roman" w:hAnsi="Times New Roman" w:eastAsia="Times New Roman" w:cs="Times New Roman"/>
                 <w:b w:val="0"/>
+                <w:color w:val="000000"/>
                 <w:sz w:val="22"/>
               </w:rPr>
               <w:t>Руководитель проекта</w:t>
@@ -384,6 +404,7 @@
               <w:rPr>
                 <w:rFonts w:ascii="Times New Roman" w:hAnsi="Times New Roman" w:eastAsia="Times New Roman" w:cs="Times New Roman"/>
                 <w:b w:val="0"/>
+                <w:color w:val="000000"/>
                 <w:sz w:val="22"/>
               </w:rPr>
             </w:r>
@@ -405,6 +426,7 @@
               <w:rPr>
                 <w:rFonts w:ascii="Times New Roman" w:hAnsi="Times New Roman" w:eastAsia="Times New Roman" w:cs="Times New Roman"/>
                 <w:b w:val="0"/>
+                <w:color w:val="000000"/>
                 <w:sz w:val="22"/>
               </w:rPr>
               <w:t>Дата старта и дата результата</w:t>
@@ -425,6 +447,7 @@
               <w:rPr>
                 <w:rFonts w:ascii="Times New Roman" w:hAnsi="Times New Roman" w:eastAsia="Times New Roman" w:cs="Times New Roman"/>
                 <w:b w:val="0"/>
+                <w:color w:val="000000"/>
                 <w:sz w:val="22"/>
               </w:rPr>
             </w:r>
@@ -447,6 +470,7 @@
           <w:rFonts w:ascii="Times New Roman" w:hAnsi="Times New Roman" w:eastAsia="Times New Roman" w:cs="Times New Roman"/>
           <w:b/>
           <w:i w:val="0"/>
+          <w:color w:val="000000"/>
           <w:sz w:val="28"/>
         </w:rPr>
         <w:t>2. Цель и выгода</w:t>
@@ -463,6 +487,7 @@
           <w:rFonts w:ascii="Times New Roman" w:hAnsi="Times New Roman" w:eastAsia="Times New Roman" w:cs="Times New Roman"/>
           <w:b w:val="0"/>
           <w:i w:val="0"/>
+          <w:color w:val="000000"/>
           <w:sz w:val="28"/>
         </w:rPr>
         <w:t>Цель по SMART (одно предложение, измеримая):</w:t>
@@ -479,9 +504,9 @@
           <w:rFonts w:ascii="Times New Roman" w:hAnsi="Times New Roman" w:eastAsia="Times New Roman" w:cs="Times New Roman"/>
           <w:b w:val="0"/>
           <w:i w:val="0"/>
+          <w:color w:val="000000"/>
           <w:sz w:val="28"/>
         </w:rPr>
-        <w:t>________________________________________________________________________</w:t>
       </w:r>
     </w:p>
     <w:p>
@@ -495,6 +520,7 @@
           <w:rFonts w:ascii="Times New Roman" w:hAnsi="Times New Roman" w:eastAsia="Times New Roman" w:cs="Times New Roman"/>
           <w:b w:val="0"/>
           <w:i w:val="0"/>
+          <w:color w:val="000000"/>
           <w:sz w:val="28"/>
         </w:rPr>
         <w:t>Выгода для колледжа (что изменится после запуска):</w:t>
@@ -511,9 +537,9 @@
           <w:rFonts w:ascii="Times New Roman" w:hAnsi="Times New Roman" w:eastAsia="Times New Roman" w:cs="Times New Roman"/>
           <w:b w:val="0"/>
           <w:i w:val="0"/>
+          <w:color w:val="000000"/>
           <w:sz w:val="28"/>
         </w:rPr>
-        <w:t>________________________________________________________________________</w:t>
       </w:r>
     </w:p>
     <w:p>
@@ -530,6 +556,7 @@
           <w:rFonts w:ascii="Times New Roman" w:hAnsi="Times New Roman" w:eastAsia="Times New Roman" w:cs="Times New Roman"/>
           <w:b/>
           <w:i w:val="0"/>
+          <w:color w:val="000000"/>
           <w:sz w:val="28"/>
         </w:rPr>
         <w:t>3. Границы проекта</w:t>
@@ -561,6 +588,7 @@
               <w:rPr>
                 <w:rFonts w:ascii="Times New Roman" w:hAnsi="Times New Roman" w:eastAsia="Times New Roman" w:cs="Times New Roman"/>
                 <w:b/>
+                <w:color w:val="000000"/>
                 <w:sz w:val="22"/>
               </w:rPr>
               <w:t>Входит в проект</w:t>
@@ -581,6 +609,7 @@
               <w:rPr>
                 <w:rFonts w:ascii="Times New Roman" w:hAnsi="Times New Roman" w:eastAsia="Times New Roman" w:cs="Times New Roman"/>
                 <w:b/>
+                <w:color w:val="000000"/>
                 <w:sz w:val="22"/>
               </w:rPr>
               <w:t>Не входит в проект</w:t>
@@ -603,6 +632,7 @@
               <w:rPr>
                 <w:rFonts w:ascii="Times New Roman" w:hAnsi="Times New Roman" w:eastAsia="Times New Roman" w:cs="Times New Roman"/>
                 <w:b w:val="0"/>
+                <w:color w:val="000000"/>
                 <w:sz w:val="22"/>
               </w:rPr>
             </w:r>
@@ -622,6 +652,7 @@
               <w:rPr>
                 <w:rFonts w:ascii="Times New Roman" w:hAnsi="Times New Roman" w:eastAsia="Times New Roman" w:cs="Times New Roman"/>
                 <w:b w:val="0"/>
+                <w:color w:val="000000"/>
                 <w:sz w:val="22"/>
               </w:rPr>
             </w:r>
@@ -643,6 +674,7 @@
               <w:rPr>
                 <w:rFonts w:ascii="Times New Roman" w:hAnsi="Times New Roman" w:eastAsia="Times New Roman" w:cs="Times New Roman"/>
                 <w:b w:val="0"/>
+                <w:color w:val="000000"/>
                 <w:sz w:val="22"/>
               </w:rPr>
             </w:r>
@@ -662,6 +694,7 @@
               <w:rPr>
                 <w:rFonts w:ascii="Times New Roman" w:hAnsi="Times New Roman" w:eastAsia="Times New Roman" w:cs="Times New Roman"/>
                 <w:b w:val="0"/>
+                <w:color w:val="000000"/>
                 <w:sz w:val="22"/>
               </w:rPr>
             </w:r>
@@ -683,6 +716,7 @@
               <w:rPr>
                 <w:rFonts w:ascii="Times New Roman" w:hAnsi="Times New Roman" w:eastAsia="Times New Roman" w:cs="Times New Roman"/>
                 <w:b w:val="0"/>
+                <w:color w:val="000000"/>
                 <w:sz w:val="22"/>
               </w:rPr>
             </w:r>
@@ -702,6 +736,7 @@
               <w:rPr>
                 <w:rFonts w:ascii="Times New Roman" w:hAnsi="Times New Roman" w:eastAsia="Times New Roman" w:cs="Times New Roman"/>
                 <w:b w:val="0"/>
+                <w:color w:val="000000"/>
                 <w:sz w:val="22"/>
               </w:rPr>
             </w:r>
@@ -723,6 +758,7 @@
               <w:rPr>
                 <w:rFonts w:ascii="Times New Roman" w:hAnsi="Times New Roman" w:eastAsia="Times New Roman" w:cs="Times New Roman"/>
                 <w:b w:val="0"/>
+                <w:color w:val="000000"/>
                 <w:sz w:val="22"/>
               </w:rPr>
             </w:r>
@@ -742,6 +778,7 @@
               <w:rPr>
                 <w:rFonts w:ascii="Times New Roman" w:hAnsi="Times New Roman" w:eastAsia="Times New Roman" w:cs="Times New Roman"/>
                 <w:b w:val="0"/>
+                <w:color w:val="000000"/>
                 <w:sz w:val="22"/>
               </w:rPr>
             </w:r>
@@ -764,6 +801,7 @@
           <w:rFonts w:ascii="Times New Roman" w:hAnsi="Times New Roman" w:eastAsia="Times New Roman" w:cs="Times New Roman"/>
           <w:b/>
           <w:i w:val="0"/>
+          <w:color w:val="000000"/>
           <w:sz w:val="28"/>
         </w:rPr>
         <w:t>4. Результаты и вехи</w:t>
@@ -796,6 +834,7 @@
               <w:rPr>
                 <w:rFonts w:ascii="Times New Roman" w:hAnsi="Times New Roman" w:eastAsia="Times New Roman" w:cs="Times New Roman"/>
                 <w:b/>
+                <w:color w:val="000000"/>
                 <w:sz w:val="22"/>
               </w:rPr>
               <w:t>Результат</w:t>
@@ -816,6 +855,7 @@
               <w:rPr>
                 <w:rFonts w:ascii="Times New Roman" w:hAnsi="Times New Roman" w:eastAsia="Times New Roman" w:cs="Times New Roman"/>
                 <w:b/>
+                <w:color w:val="000000"/>
                 <w:sz w:val="22"/>
               </w:rPr>
               <w:t>Критерий готовности</w:t>
@@ -836,6 +876,7 @@
               <w:rPr>
                 <w:rFonts w:ascii="Times New Roman" w:hAnsi="Times New Roman" w:eastAsia="Times New Roman" w:cs="Times New Roman"/>
                 <w:b/>
+                <w:color w:val="000000"/>
                 <w:sz w:val="22"/>
               </w:rPr>
               <w:t>Дата</w:t>
@@ -858,6 +899,7 @@
               <w:rPr>
                 <w:rFonts w:ascii="Times New Roman" w:hAnsi="Times New Roman" w:eastAsia="Times New Roman" w:cs="Times New Roman"/>
                 <w:b w:val="0"/>
+                <w:color w:val="000000"/>
                 <w:sz w:val="22"/>
               </w:rPr>
             </w:r>
@@ -877,6 +919,7 @@
               <w:rPr>
                 <w:rFonts w:ascii="Times New Roman" w:hAnsi="Times New Roman" w:eastAsia="Times New Roman" w:cs="Times New Roman"/>
                 <w:b w:val="0"/>
+                <w:color w:val="000000"/>
                 <w:sz w:val="22"/>
               </w:rPr>
             </w:r>
@@ -896,6 +939,7 @@
               <w:rPr>
                 <w:rFonts w:ascii="Times New Roman" w:hAnsi="Times New Roman" w:eastAsia="Times New Roman" w:cs="Times New Roman"/>
                 <w:b w:val="0"/>
+                <w:color w:val="000000"/>
                 <w:sz w:val="22"/>
               </w:rPr>
             </w:r>
@@ -917,6 +961,7 @@
               <w:rPr>
                 <w:rFonts w:ascii="Times New Roman" w:hAnsi="Times New Roman" w:eastAsia="Times New Roman" w:cs="Times New Roman"/>
                 <w:b w:val="0"/>
+                <w:color w:val="000000"/>
                 <w:sz w:val="22"/>
               </w:rPr>
             </w:r>
@@ -936,6 +981,7 @@
               <w:rPr>
                 <w:rFonts w:ascii="Times New Roman" w:hAnsi="Times New Roman" w:eastAsia="Times New Roman" w:cs="Times New Roman"/>
                 <w:b w:val="0"/>
+                <w:color w:val="000000"/>
                 <w:sz w:val="22"/>
               </w:rPr>
             </w:r>
@@ -955,6 +1001,7 @@
               <w:rPr>
                 <w:rFonts w:ascii="Times New Roman" w:hAnsi="Times New Roman" w:eastAsia="Times New Roman" w:cs="Times New Roman"/>
                 <w:b w:val="0"/>
+                <w:color w:val="000000"/>
                 <w:sz w:val="22"/>
               </w:rPr>
             </w:r>
@@ -976,6 +1023,7 @@
               <w:rPr>
                 <w:rFonts w:ascii="Times New Roman" w:hAnsi="Times New Roman" w:eastAsia="Times New Roman" w:cs="Times New Roman"/>
                 <w:b w:val="0"/>
+                <w:color w:val="000000"/>
                 <w:sz w:val="22"/>
               </w:rPr>
             </w:r>
@@ -995,6 +1043,7 @@
               <w:rPr>
                 <w:rFonts w:ascii="Times New Roman" w:hAnsi="Times New Roman" w:eastAsia="Times New Roman" w:cs="Times New Roman"/>
                 <w:b w:val="0"/>
+                <w:color w:val="000000"/>
                 <w:sz w:val="22"/>
               </w:rPr>
             </w:r>
@@ -1014,6 +1063,7 @@
               <w:rPr>
                 <w:rFonts w:ascii="Times New Roman" w:hAnsi="Times New Roman" w:eastAsia="Times New Roman" w:cs="Times New Roman"/>
                 <w:b w:val="0"/>
+                <w:color w:val="000000"/>
                 <w:sz w:val="22"/>
               </w:rPr>
             </w:r>
@@ -1035,6 +1085,7 @@
               <w:rPr>
                 <w:rFonts w:ascii="Times New Roman" w:hAnsi="Times New Roman" w:eastAsia="Times New Roman" w:cs="Times New Roman"/>
                 <w:b w:val="0"/>
+                <w:color w:val="000000"/>
                 <w:sz w:val="22"/>
               </w:rPr>
             </w:r>
@@ -1054,6 +1105,7 @@
               <w:rPr>
                 <w:rFonts w:ascii="Times New Roman" w:hAnsi="Times New Roman" w:eastAsia="Times New Roman" w:cs="Times New Roman"/>
                 <w:b w:val="0"/>
+                <w:color w:val="000000"/>
                 <w:sz w:val="22"/>
               </w:rPr>
             </w:r>
@@ -1073,6 +1125,7 @@
               <w:rPr>
                 <w:rFonts w:ascii="Times New Roman" w:hAnsi="Times New Roman" w:eastAsia="Times New Roman" w:cs="Times New Roman"/>
                 <w:b w:val="0"/>
+                <w:color w:val="000000"/>
                 <w:sz w:val="22"/>
               </w:rPr>
             </w:r>
@@ -1095,6 +1148,7 @@
           <w:rFonts w:ascii="Times New Roman" w:hAnsi="Times New Roman" w:eastAsia="Times New Roman" w:cs="Times New Roman"/>
           <w:b/>
           <w:i w:val="0"/>
+          <w:color w:val="000000"/>
           <w:sz w:val="28"/>
         </w:rPr>
         <w:t>5. Бюджет и ресурсы</w:t>
@@ -1127,6 +1181,7 @@
               <w:rPr>
                 <w:rFonts w:ascii="Times New Roman" w:hAnsi="Times New Roman" w:eastAsia="Times New Roman" w:cs="Times New Roman"/>
                 <w:b/>
+                <w:color w:val="000000"/>
                 <w:sz w:val="22"/>
               </w:rPr>
               <w:t>Статья</w:t>
@@ -1147,6 +1202,7 @@
               <w:rPr>
                 <w:rFonts w:ascii="Times New Roman" w:hAnsi="Times New Roman" w:eastAsia="Times New Roman" w:cs="Times New Roman"/>
                 <w:b/>
+                <w:color w:val="000000"/>
                 <w:sz w:val="22"/>
               </w:rPr>
               <w:t>Сумма, руб.</w:t>
@@ -1167,6 +1223,7 @@
               <w:rPr>
                 <w:rFonts w:ascii="Times New Roman" w:hAnsi="Times New Roman" w:eastAsia="Times New Roman" w:cs="Times New Roman"/>
                 <w:b/>
+                <w:color w:val="000000"/>
                 <w:sz w:val="22"/>
               </w:rPr>
               <w:t>Комментарий</w:t>
@@ -1189,6 +1246,7 @@
               <w:rPr>
                 <w:rFonts w:ascii="Times New Roman" w:hAnsi="Times New Roman" w:eastAsia="Times New Roman" w:cs="Times New Roman"/>
                 <w:b w:val="0"/>
+                <w:color w:val="000000"/>
                 <w:sz w:val="22"/>
               </w:rPr>
               <w:t>Оплата труда</w:t>
@@ -1209,6 +1267,7 @@
               <w:rPr>
                 <w:rFonts w:ascii="Times New Roman" w:hAnsi="Times New Roman" w:eastAsia="Times New Roman" w:cs="Times New Roman"/>
                 <w:b w:val="0"/>
+                <w:color w:val="000000"/>
                 <w:sz w:val="22"/>
               </w:rPr>
             </w:r>
@@ -1228,6 +1287,7 @@
               <w:rPr>
                 <w:rFonts w:ascii="Times New Roman" w:hAnsi="Times New Roman" w:eastAsia="Times New Roman" w:cs="Times New Roman"/>
                 <w:b w:val="0"/>
+                <w:color w:val="000000"/>
                 <w:sz w:val="22"/>
               </w:rPr>
             </w:r>
@@ -1249,6 +1309,7 @@
               <w:rPr>
                 <w:rFonts w:ascii="Times New Roman" w:hAnsi="Times New Roman" w:eastAsia="Times New Roman" w:cs="Times New Roman"/>
                 <w:b w:val="0"/>
+                <w:color w:val="000000"/>
                 <w:sz w:val="22"/>
               </w:rPr>
               <w:t>Оборудование и ПО</w:t>
@@ -1269,6 +1330,7 @@
               <w:rPr>
                 <w:rFonts w:ascii="Times New Roman" w:hAnsi="Times New Roman" w:eastAsia="Times New Roman" w:cs="Times New Roman"/>
                 <w:b w:val="0"/>
+                <w:color w:val="000000"/>
                 <w:sz w:val="22"/>
               </w:rPr>
             </w:r>
@@ -1288,6 +1350,7 @@
               <w:rPr>
                 <w:rFonts w:ascii="Times New Roman" w:hAnsi="Times New Roman" w:eastAsia="Times New Roman" w:cs="Times New Roman"/>
                 <w:b w:val="0"/>
+                <w:color w:val="000000"/>
                 <w:sz w:val="22"/>
               </w:rPr>
             </w:r>
@@ -1309,6 +1372,7 @@
               <w:rPr>
                 <w:rFonts w:ascii="Times New Roman" w:hAnsi="Times New Roman" w:eastAsia="Times New Roman" w:cs="Times New Roman"/>
                 <w:b w:val="0"/>
+                <w:color w:val="000000"/>
                 <w:sz w:val="22"/>
               </w:rPr>
               <w:t>Резерв</w:t>
@@ -1329,6 +1393,7 @@
               <w:rPr>
                 <w:rFonts w:ascii="Times New Roman" w:hAnsi="Times New Roman" w:eastAsia="Times New Roman" w:cs="Times New Roman"/>
                 <w:b w:val="0"/>
+                <w:color w:val="000000"/>
                 <w:sz w:val="22"/>
               </w:rPr>
             </w:r>
@@ -1348,6 +1413,7 @@
               <w:rPr>
                 <w:rFonts w:ascii="Times New Roman" w:hAnsi="Times New Roman" w:eastAsia="Times New Roman" w:cs="Times New Roman"/>
                 <w:b w:val="0"/>
+                <w:color w:val="000000"/>
                 <w:sz w:val="22"/>
               </w:rPr>
             </w:r>
@@ -1369,6 +1435,7 @@
               <w:rPr>
                 <w:rFonts w:ascii="Times New Roman" w:hAnsi="Times New Roman" w:eastAsia="Times New Roman" w:cs="Times New Roman"/>
                 <w:b w:val="0"/>
+                <w:color w:val="000000"/>
                 <w:sz w:val="22"/>
               </w:rPr>
               <w:t>Итого</w:t>
@@ -1389,6 +1456,7 @@
               <w:rPr>
                 <w:rFonts w:ascii="Times New Roman" w:hAnsi="Times New Roman" w:eastAsia="Times New Roman" w:cs="Times New Roman"/>
                 <w:b w:val="0"/>
+                <w:color w:val="000000"/>
                 <w:sz w:val="22"/>
               </w:rPr>
             </w:r>
@@ -1408,6 +1476,7 @@
               <w:rPr>
                 <w:rFonts w:ascii="Times New Roman" w:hAnsi="Times New Roman" w:eastAsia="Times New Roman" w:cs="Times New Roman"/>
                 <w:b w:val="0"/>
+                <w:color w:val="000000"/>
                 <w:sz w:val="22"/>
               </w:rPr>
             </w:r>
@@ -1430,6 +1499,7 @@
           <w:rFonts w:ascii="Times New Roman" w:hAnsi="Times New Roman" w:eastAsia="Times New Roman" w:cs="Times New Roman"/>
           <w:b/>
           <w:i w:val="0"/>
+          <w:color w:val="000000"/>
           <w:sz w:val="28"/>
         </w:rPr>
         <w:t>6. Ключевые риски и допущения</w:t>
@@ -1462,6 +1532,7 @@
               <w:rPr>
                 <w:rFonts w:ascii="Times New Roman" w:hAnsi="Times New Roman" w:eastAsia="Times New Roman" w:cs="Times New Roman"/>
                 <w:b/>
+                <w:color w:val="000000"/>
                 <w:sz w:val="22"/>
               </w:rPr>
               <w:t>Риск или допущение</w:t>
@@ -1482,6 +1553,7 @@
               <w:rPr>
                 <w:rFonts w:ascii="Times New Roman" w:hAnsi="Times New Roman" w:eastAsia="Times New Roman" w:cs="Times New Roman"/>
                 <w:b/>
+                <w:color w:val="000000"/>
                 <w:sz w:val="22"/>
               </w:rPr>
               <w:t>Влияние</w:t>
@@ -1502,6 +1574,7 @@
               <w:rPr>
                 <w:rFonts w:ascii="Times New Roman" w:hAnsi="Times New Roman" w:eastAsia="Times New Roman" w:cs="Times New Roman"/>
                 <w:b/>
+                <w:color w:val="000000"/>
                 <w:sz w:val="22"/>
               </w:rPr>
               <w:t>Что делаем</w:t>
@@ -1524,6 +1597,7 @@
               <w:rPr>
                 <w:rFonts w:ascii="Times New Roman" w:hAnsi="Times New Roman" w:eastAsia="Times New Roman" w:cs="Times New Roman"/>
                 <w:b w:val="0"/>
+                <w:color w:val="000000"/>
                 <w:sz w:val="22"/>
               </w:rPr>
             </w:r>
@@ -1543,6 +1617,7 @@
               <w:rPr>
                 <w:rFonts w:ascii="Times New Roman" w:hAnsi="Times New Roman" w:eastAsia="Times New Roman" w:cs="Times New Roman"/>
                 <w:b w:val="0"/>
+                <w:color w:val="000000"/>
                 <w:sz w:val="22"/>
               </w:rPr>
             </w:r>
@@ -1562,6 +1637,7 @@
               <w:rPr>
                 <w:rFonts w:ascii="Times New Roman" w:hAnsi="Times New Roman" w:eastAsia="Times New Roman" w:cs="Times New Roman"/>
                 <w:b w:val="0"/>
+                <w:color w:val="000000"/>
                 <w:sz w:val="22"/>
               </w:rPr>
             </w:r>
@@ -1583,6 +1659,7 @@
               <w:rPr>
                 <w:rFonts w:ascii="Times New Roman" w:hAnsi="Times New Roman" w:eastAsia="Times New Roman" w:cs="Times New Roman"/>
                 <w:b w:val="0"/>
+                <w:color w:val="000000"/>
                 <w:sz w:val="22"/>
               </w:rPr>
             </w:r>
@@ -1602,6 +1679,7 @@
               <w:rPr>
                 <w:rFonts w:ascii="Times New Roman" w:hAnsi="Times New Roman" w:eastAsia="Times New Roman" w:cs="Times New Roman"/>
                 <w:b w:val="0"/>
+                <w:color w:val="000000"/>
                 <w:sz w:val="22"/>
               </w:rPr>
             </w:r>
@@ -1621,6 +1699,7 @@
               <w:rPr>
                 <w:rFonts w:ascii="Times New Roman" w:hAnsi="Times New Roman" w:eastAsia="Times New Roman" w:cs="Times New Roman"/>
                 <w:b w:val="0"/>
+                <w:color w:val="000000"/>
                 <w:sz w:val="22"/>
               </w:rPr>
             </w:r>
@@ -1642,6 +1721,7 @@
               <w:rPr>
                 <w:rFonts w:ascii="Times New Roman" w:hAnsi="Times New Roman" w:eastAsia="Times New Roman" w:cs="Times New Roman"/>
                 <w:b w:val="0"/>
+                <w:color w:val="000000"/>
                 <w:sz w:val="22"/>
               </w:rPr>
             </w:r>
@@ -1661,6 +1741,7 @@
               <w:rPr>
                 <w:rFonts w:ascii="Times New Roman" w:hAnsi="Times New Roman" w:eastAsia="Times New Roman" w:cs="Times New Roman"/>
                 <w:b w:val="0"/>
+                <w:color w:val="000000"/>
                 <w:sz w:val="22"/>
               </w:rPr>
             </w:r>
@@ -1680,6 +1761,7 @@
               <w:rPr>
                 <w:rFonts w:ascii="Times New Roman" w:hAnsi="Times New Roman" w:eastAsia="Times New Roman" w:cs="Times New Roman"/>
                 <w:b w:val="0"/>
+                <w:color w:val="000000"/>
                 <w:sz w:val="22"/>
               </w:rPr>
             </w:r>
@@ -1702,6 +1784,7 @@
           <w:rFonts w:ascii="Times New Roman" w:hAnsi="Times New Roman" w:eastAsia="Times New Roman" w:cs="Times New Roman"/>
           <w:b/>
           <w:i w:val="0"/>
+          <w:color w:val="000000"/>
           <w:sz w:val="28"/>
         </w:rPr>
         <w:t>7. Полномочия и подписи</w:t>
@@ -1718,9 +1801,10 @@
           <w:rFonts w:ascii="Times New Roman" w:hAnsi="Times New Roman" w:eastAsia="Times New Roman" w:cs="Times New Roman"/>
           <w:b w:val="0"/>
           <w:i w:val="0"/>
+          <w:color w:val="000000"/>
           <w:sz w:val="28"/>
         </w:rPr>
-        <w:t>Руководитель проекта имеет право: ______________________________________</w:t>
+        <w:t xml:space="preserve">Руководитель проекта имеет право: </w:t>
       </w:r>
     </w:p>
     <w:p>
@@ -1734,9 +1818,10 @@
           <w:rFonts w:ascii="Times New Roman" w:hAnsi="Times New Roman" w:eastAsia="Times New Roman" w:cs="Times New Roman"/>
           <w:b w:val="0"/>
           <w:i w:val="0"/>
+          <w:color w:val="000000"/>
           <w:sz w:val="28"/>
         </w:rPr>
-        <w:t>Спонсор подтверждает цель, бюджет и срок: ____________________ / __________</w:t>
+        <w:t xml:space="preserve">Спонсор подтверждает цель, бюджет и срок:  / </w:t>
       </w:r>
     </w:p>
     <w:p>
@@ -1753,6 +1838,7 @@
           <w:rFonts w:ascii="Times New Roman" w:hAnsi="Times New Roman" w:eastAsia="Times New Roman" w:cs="Times New Roman"/>
           <w:b w:val="0"/>
           <w:i w:val="0"/>
+          <w:color w:val="000000"/>
           <w:sz w:val="28"/>
         </w:rPr>
         <w:t>Контрольные вопросы</w:t>
@@ -1769,6 +1855,7 @@
           <w:rFonts w:ascii="Times New Roman" w:hAnsi="Times New Roman" w:eastAsia="Times New Roman" w:cs="Times New Roman"/>
           <w:b w:val="0"/>
           <w:i w:val="0"/>
+          <w:color w:val="000000"/>
           <w:sz w:val="28"/>
         </w:rPr>
         <w:t>1. Чем цель проекта отличается от его результата?</w:t>
@@ -1785,6 +1872,7 @@
           <w:rFonts w:ascii="Times New Roman" w:hAnsi="Times New Roman" w:eastAsia="Times New Roman" w:cs="Times New Roman"/>
           <w:b w:val="0"/>
           <w:i w:val="0"/>
+          <w:color w:val="000000"/>
           <w:sz w:val="28"/>
         </w:rPr>
         <w:t>2. Почему границы проекта записывают отдельным списком?</w:t>
@@ -1801,6 +1889,7 @@
           <w:rFonts w:ascii="Times New Roman" w:hAnsi="Times New Roman" w:eastAsia="Times New Roman" w:cs="Times New Roman"/>
           <w:b w:val="0"/>
           <w:i w:val="0"/>
+          <w:color w:val="000000"/>
           <w:sz w:val="28"/>
         </w:rPr>
         <w:t>3. Какая веха доказывает, что проект готов к приёмке?</w:t>
@@ -1817,6 +1906,7 @@
           <w:rFonts w:ascii="Times New Roman" w:hAnsi="Times New Roman" w:eastAsia="Times New Roman" w:cs="Times New Roman"/>
           <w:b w:val="0"/>
           <w:i w:val="0"/>
+          <w:color w:val="000000"/>
           <w:sz w:val="28"/>
         </w:rPr>
         <w:t>4. Что произойдёт, если в уставе нет критерия готовности?</w:t>
@@ -1833,6 +1923,7 @@
           <w:rFonts w:ascii="Times New Roman" w:hAnsi="Times New Roman" w:eastAsia="Times New Roman" w:cs="Times New Roman"/>
           <w:b w:val="0"/>
           <w:i w:val="0"/>
+          <w:color w:val="000000"/>
           <w:sz w:val="28"/>
         </w:rPr>
         <w:t>5. Кто имеет право остановить проект и на каком основании?</w:t>
@@ -1853,6 +1944,7 @@
           <w:rFonts w:ascii="Times New Roman" w:hAnsi="Times New Roman" w:eastAsia="Times New Roman" w:cs="Times New Roman"/>
           <w:b w:val="0"/>
           <w:i w:val="0"/>
+          <w:color w:val="000000"/>
           <w:sz w:val="28"/>
         </w:rPr>
         <w:t>Критерии оценки</w:t>
@@ -1884,6 +1976,7 @@
               <w:rPr>
                 <w:rFonts w:ascii="Times New Roman" w:hAnsi="Times New Roman" w:eastAsia="Times New Roman" w:cs="Times New Roman"/>
                 <w:b/>
+                <w:color w:val="000000"/>
                 <w:sz w:val="22"/>
               </w:rPr>
               <w:t>Балл</w:t>
@@ -1904,6 +1997,7 @@
               <w:rPr>
                 <w:rFonts w:ascii="Times New Roman" w:hAnsi="Times New Roman" w:eastAsia="Times New Roman" w:cs="Times New Roman"/>
                 <w:b/>
+                <w:color w:val="000000"/>
                 <w:sz w:val="22"/>
               </w:rPr>
               <w:t>Что должно быть сделано</w:t>
@@ -1926,6 +2020,7 @@
               <w:rPr>
                 <w:rFonts w:ascii="Times New Roman" w:hAnsi="Times New Roman" w:eastAsia="Times New Roman" w:cs="Times New Roman"/>
                 <w:b w:val="0"/>
+                <w:color w:val="000000"/>
                 <w:sz w:val="22"/>
               </w:rPr>
               <w:t>5</w:t>
@@ -1946,6 +2041,7 @@
               <w:rPr>
                 <w:rFonts w:ascii="Times New Roman" w:hAnsi="Times New Roman" w:eastAsia="Times New Roman" w:cs="Times New Roman"/>
                 <w:b w:val="0"/>
+                <w:color w:val="000000"/>
                 <w:sz w:val="22"/>
               </w:rPr>
               <w:t>Все семь разделов заполнены, цель измерима, границы непротиворечивы, бюджет сходится, риски имеют меры.</w:t>
@@ -1968,6 +2064,7 @@
               <w:rPr>
                 <w:rFonts w:ascii="Times New Roman" w:hAnsi="Times New Roman" w:eastAsia="Times New Roman" w:cs="Times New Roman"/>
                 <w:b w:val="0"/>
+                <w:color w:val="000000"/>
                 <w:sz w:val="22"/>
               </w:rPr>
               <w:t>4</w:t>
@@ -1988,6 +2085,7 @@
               <w:rPr>
                 <w:rFonts w:ascii="Times New Roman" w:hAnsi="Times New Roman" w:eastAsia="Times New Roman" w:cs="Times New Roman"/>
                 <w:b w:val="0"/>
+                <w:color w:val="000000"/>
                 <w:sz w:val="22"/>
               </w:rPr>
               <w:t>Разделы заполнены, есть одна неточность в цели или границах, бюджет сходится.</w:t>
@@ -2010,6 +2108,7 @@
               <w:rPr>
                 <w:rFonts w:ascii="Times New Roman" w:hAnsi="Times New Roman" w:eastAsia="Times New Roman" w:cs="Times New Roman"/>
                 <w:b w:val="0"/>
+                <w:color w:val="000000"/>
                 <w:sz w:val="22"/>
               </w:rPr>
               <w:t>3</w:t>
@@ -2030,6 +2129,7 @@
               <w:rPr>
                 <w:rFonts w:ascii="Times New Roman" w:hAnsi="Times New Roman" w:eastAsia="Times New Roman" w:cs="Times New Roman"/>
                 <w:b w:val="0"/>
+                <w:color w:val="000000"/>
                 <w:sz w:val="22"/>
               </w:rPr>
               <w:t>Заполнены основные разделы, границы размыты или нет критериев готовности.</w:t>
@@ -2053,6 +2153,7 @@
           <w:rFonts w:ascii="Times New Roman" w:hAnsi="Times New Roman" w:eastAsia="Times New Roman" w:cs="Times New Roman"/>
           <w:b w:val="0"/>
           <w:i w:val="0"/>
+          <w:color w:val="000000"/>
           <w:sz w:val="28"/>
         </w:rPr>
         <w:t>Вывод</w:t>
@@ -2069,9 +2170,9 @@
           <w:rFonts w:ascii="Times New Roman" w:hAnsi="Times New Roman" w:eastAsia="Times New Roman" w:cs="Times New Roman"/>
           <w:b w:val="0"/>
           <w:i w:val="0"/>
+          <w:color w:val="000000"/>
           <w:sz w:val="28"/>
         </w:rPr>
-        <w:t>________________________________________________________________________</w:t>
       </w:r>
     </w:p>
     <w:p>
@@ -2085,9 +2186,9 @@
           <w:rFonts w:ascii="Times New Roman" w:hAnsi="Times New Roman" w:eastAsia="Times New Roman" w:cs="Times New Roman"/>
           <w:b w:val="0"/>
           <w:i w:val="0"/>
+          <w:color w:val="000000"/>
           <w:sz w:val="28"/>
         </w:rPr>
-        <w:t>________________________________________________________________________</w:t>
       </w:r>
     </w:p>
     <w:p>
@@ -2101,9 +2202,9 @@
           <w:rFonts w:ascii="Times New Roman" w:hAnsi="Times New Roman" w:eastAsia="Times New Roman" w:cs="Times New Roman"/>
           <w:b w:val="0"/>
           <w:i w:val="0"/>
+          <w:color w:val="000000"/>
           <w:sz w:val="28"/>
         </w:rPr>
-        <w:t>________________________________________________________________________</w:t>
       </w:r>
     </w:p>
     <w:sectPr>
@@ -2486,6 +2587,7 @@
     </w:pPr>
     <w:rPr>
       <w:rFonts w:ascii="Times New Roman" w:hAnsi="Times New Roman" w:eastAsia="Times New Roman" w:cs="Times New Roman"/>
+      <w:color w:val="000000"/>
       <w:sz w:val="28"/>
     </w:rPr>
   </w:style>
@@ -2553,7 +2655,7 @@
       <w:rFonts w:asciiTheme="majorHAnsi" w:eastAsiaTheme="majorEastAsia" w:hAnsiTheme="majorHAnsi" w:cstheme="majorBidi" w:ascii="Times New Roman" w:hAnsi="Times New Roman" w:eastAsia="Times New Roman" w:cs="Times New Roman"/>
       <w:b w:val="0"/>
       <w:bCs/>
-      <w:color w:val="365F91" w:themeColor="accent1" w:themeShade="BF"/>
+      <w:color w:val="000000"/>
       <w:sz w:val="28"/>
       <w:szCs w:val="28"/>
     </w:rPr>
@@ -2579,7 +2681,7 @@
       <w:rFonts w:asciiTheme="majorHAnsi" w:eastAsiaTheme="majorEastAsia" w:hAnsiTheme="majorHAnsi" w:cstheme="majorBidi" w:ascii="Times New Roman" w:hAnsi="Times New Roman" w:eastAsia="Times New Roman" w:cs="Times New Roman"/>
       <w:b/>
       <w:bCs/>
-      <w:color w:val="4F81BD" w:themeColor="accent1"/>
+      <w:color w:val="000000"/>
       <w:sz w:val="28"/>
       <w:szCs w:val="26"/>
     </w:rPr>
@@ -2916,6 +3018,7 @@
     </w:pPr>
     <w:rPr>
       <w:rFonts w:ascii="Times New Roman" w:hAnsi="Times New Roman" w:eastAsia="Times New Roman" w:cs="Times New Roman"/>
+      <w:color w:val="000000"/>
       <w:sz w:val="28"/>
     </w:rPr>
   </w:style>

</xml_diff>